<commit_message>
Remove dates from agency documents so they can be filled in manually
Co-Authored-By: Claude Opus 5.5 <noreply@anthropic.com>
Claude-Session: https://claude.ai/code/session_01P5njy2pndSsBFLMsP1j6Uw
</commit_message>
<xml_diff>
--- a/AG-001 مستندات نمایندگی - بردیا تجارت ماندگار.docx
+++ b/AG-001 مستندات نمایندگی - بردیا تجارت ماندگار.docx
@@ -1169,7 +1169,7 @@
           <w:szCs w:val="24"/>
           <w:rtl/>
         </w:rPr>
-        <w:t>فهرست زیر نمایندگان فعال شرکت در تاریخ ۱۴۰۵/۰۸/۱۰ است. همه نمایندگان برنج و چای دریافت می‌کنند و قرارداد همه آن‌ها از ۱۴۰۵/۰۸/۱۰ شروع شده و تا ۱۴۰۶/۰۸/۰۹ اعتبار دارد.</w:t>
+        <w:t>فهرست زیر نمایندگان فعال شرکت است. همه نمایندگان برنج و چای دریافت می‌کنند. تاریخ شروع و پایان قرارداد هر نماینده در جدول وارد می‌شود.</w:t>
       </w:r>
     </w:p>
     <w:tbl>
@@ -1196,12 +1196,13 @@
         <w:tblLayout w:type="fixed"/>
       </w:tblPr>
       <w:tblGrid>
-        <w:gridCol w:w="680"/>
-        <w:gridCol w:w="1587"/>
-        <w:gridCol w:w="3061"/>
-        <w:gridCol w:w="1247"/>
-        <w:gridCol w:w="2154"/>
-        <w:gridCol w:w="1134"/>
+        <w:gridCol w:w="567"/>
+        <w:gridCol w:w="1474"/>
+        <w:gridCol w:w="2608"/>
+        <w:gridCol w:w="1020"/>
+        <w:gridCol w:w="1814"/>
+        <w:gridCol w:w="1191"/>
+        <w:gridCol w:w="1191"/>
       </w:tblGrid>
       <w:tr>
         <w:trPr>
@@ -1211,7 +1212,7 @@
         </w:trPr>
         <w:tc>
           <w:tcPr>
-            <w:tcW w:type="dxa" w:w="680"/>
+            <w:tcW w:type="dxa" w:w="567"/>
             <w:shd w:val="clear" w:color="auto" w:fill="1F5132"/>
             <w:vAlign w:val="center"/>
           </w:tcPr>
@@ -1237,7 +1238,7 @@
         </w:tc>
         <w:tc>
           <w:tcPr>
-            <w:tcW w:type="dxa" w:w="1587"/>
+            <w:tcW w:type="dxa" w:w="1474"/>
             <w:shd w:val="clear" w:color="auto" w:fill="1F5132"/>
             <w:vAlign w:val="center"/>
           </w:tcPr>
@@ -1263,7 +1264,7 @@
         </w:tc>
         <w:tc>
           <w:tcPr>
-            <w:tcW w:type="dxa" w:w="3061"/>
+            <w:tcW w:type="dxa" w:w="2608"/>
             <w:shd w:val="clear" w:color="auto" w:fill="1F5132"/>
             <w:vAlign w:val="center"/>
           </w:tcPr>
@@ -1289,7 +1290,7 @@
         </w:tc>
         <w:tc>
           <w:tcPr>
-            <w:tcW w:type="dxa" w:w="1247"/>
+            <w:tcW w:type="dxa" w:w="1020"/>
             <w:shd w:val="clear" w:color="auto" w:fill="1F5132"/>
             <w:vAlign w:val="center"/>
           </w:tcPr>
@@ -1315,7 +1316,7 @@
         </w:tc>
         <w:tc>
           <w:tcPr>
-            <w:tcW w:type="dxa" w:w="2154"/>
+            <w:tcW w:type="dxa" w:w="1814"/>
             <w:shd w:val="clear" w:color="auto" w:fill="1F5132"/>
             <w:vAlign w:val="center"/>
           </w:tcPr>
@@ -1341,7 +1342,7 @@
         </w:tc>
         <w:tc>
           <w:tcPr>
-            <w:tcW w:type="dxa" w:w="1134"/>
+            <w:tcW w:type="dxa" w:w="1191"/>
             <w:shd w:val="clear" w:color="auto" w:fill="1F5132"/>
             <w:vAlign w:val="center"/>
           </w:tcPr>
@@ -1361,7 +1362,33 @@
                 <w:color w:val="FFFFFF"/>
                 <w:rtl/>
               </w:rPr>
-              <w:t>وضعیت</w:t>
+              <w:t>تاریخ شروع</w:t>
+            </w:r>
+          </w:p>
+        </w:tc>
+        <w:tc>
+          <w:tcPr>
+            <w:tcW w:type="dxa" w:w="1191"/>
+            <w:shd w:val="clear" w:color="auto" w:fill="1F5132"/>
+            <w:vAlign w:val="center"/>
+          </w:tcPr>
+          <w:p>
+            <w:pPr>
+              <w:bidi/>
+              <w:spacing w:after="0" w:before="0" w:line="252" w:lineRule="auto"/>
+              <w:jc w:val="center"/>
+            </w:pPr>
+            <w:r>
+              <w:rPr>
+                <w:rFonts w:ascii="B Nazanin" w:hAnsi="B Nazanin" w:cs="B Nazanin" w:eastAsia="B Nazanin"/>
+                <w:b/>
+                <w:bCs/>
+                <w:sz w:val="22"/>
+                <w:szCs w:val="22"/>
+                <w:color w:val="FFFFFF"/>
+                <w:rtl/>
+              </w:rPr>
+              <w:t>تاریخ پایان</w:t>
             </w:r>
           </w:p>
         </w:tc>
@@ -1373,7 +1400,7 @@
         </w:trPr>
         <w:tc>
           <w:tcPr>
-            <w:tcW w:type="dxa" w:w="680"/>
+            <w:tcW w:type="dxa" w:w="567"/>
             <w:shd w:val="clear" w:color="auto" w:fill="FFFFFF"/>
             <w:vAlign w:val="center"/>
           </w:tcPr>
@@ -1397,7 +1424,7 @@
         </w:tc>
         <w:tc>
           <w:tcPr>
-            <w:tcW w:type="dxa" w:w="1587"/>
+            <w:tcW w:type="dxa" w:w="1474"/>
             <w:shd w:val="clear" w:color="auto" w:fill="FFFFFF"/>
             <w:vAlign w:val="center"/>
           </w:tcPr>
@@ -1421,7 +1448,7 @@
         </w:tc>
         <w:tc>
           <w:tcPr>
-            <w:tcW w:type="dxa" w:w="3061"/>
+            <w:tcW w:type="dxa" w:w="2608"/>
             <w:shd w:val="clear" w:color="auto" w:fill="FFFFFF"/>
             <w:vAlign w:val="center"/>
           </w:tcPr>
@@ -1444,7 +1471,7 @@
         </w:tc>
         <w:tc>
           <w:tcPr>
-            <w:tcW w:type="dxa" w:w="1247"/>
+            <w:tcW w:type="dxa" w:w="1020"/>
             <w:shd w:val="clear" w:color="auto" w:fill="FFFFFF"/>
             <w:vAlign w:val="center"/>
           </w:tcPr>
@@ -1468,7 +1495,7 @@
         </w:tc>
         <w:tc>
           <w:tcPr>
-            <w:tcW w:type="dxa" w:w="2154"/>
+            <w:tcW w:type="dxa" w:w="1814"/>
             <w:shd w:val="clear" w:color="auto" w:fill="FFFFFF"/>
             <w:vAlign w:val="center"/>
           </w:tcPr>
@@ -1492,7 +1519,7 @@
         </w:tc>
         <w:tc>
           <w:tcPr>
-            <w:tcW w:type="dxa" w:w="1134"/>
+            <w:tcW w:type="dxa" w:w="1191"/>
             <w:shd w:val="clear" w:color="auto" w:fill="FFFFFF"/>
             <w:vAlign w:val="center"/>
           </w:tcPr>
@@ -1510,7 +1537,29 @@
                 <w:szCs w:val="22"/>
                 <w:rtl/>
               </w:rPr>
-              <w:t>فعال</w:t>
+            </w:r>
+          </w:p>
+        </w:tc>
+        <w:tc>
+          <w:tcPr>
+            <w:tcW w:type="dxa" w:w="1191"/>
+            <w:shd w:val="clear" w:color="auto" w:fill="FFFFFF"/>
+            <w:vAlign w:val="center"/>
+          </w:tcPr>
+          <w:p>
+            <w:pPr>
+              <w:bidi/>
+              <w:spacing w:after="0" w:before="0" w:line="252" w:lineRule="auto"/>
+              <w:jc w:val="center"/>
+            </w:pPr>
+            <w:r>
+              <w:rPr>
+                <w:rFonts w:ascii="B Nazanin" w:hAnsi="B Nazanin" w:cs="B Nazanin" w:eastAsia="B Nazanin"/>
+                <w:b w:val="0"/>
+                <w:sz w:val="22"/>
+                <w:szCs w:val="22"/>
+                <w:rtl/>
+              </w:rPr>
             </w:r>
           </w:p>
         </w:tc>
@@ -1522,7 +1571,7 @@
         </w:trPr>
         <w:tc>
           <w:tcPr>
-            <w:tcW w:type="dxa" w:w="680"/>
+            <w:tcW w:type="dxa" w:w="567"/>
             <w:shd w:val="clear" w:color="auto" w:fill="EEF6F0"/>
             <w:vAlign w:val="center"/>
           </w:tcPr>
@@ -1546,7 +1595,7 @@
         </w:tc>
         <w:tc>
           <w:tcPr>
-            <w:tcW w:type="dxa" w:w="1587"/>
+            <w:tcW w:type="dxa" w:w="1474"/>
             <w:shd w:val="clear" w:color="auto" w:fill="EEF6F0"/>
             <w:vAlign w:val="center"/>
           </w:tcPr>
@@ -1570,7 +1619,7 @@
         </w:tc>
         <w:tc>
           <w:tcPr>
-            <w:tcW w:type="dxa" w:w="3061"/>
+            <w:tcW w:type="dxa" w:w="2608"/>
             <w:shd w:val="clear" w:color="auto" w:fill="EEF6F0"/>
             <w:vAlign w:val="center"/>
           </w:tcPr>
@@ -1593,7 +1642,7 @@
         </w:tc>
         <w:tc>
           <w:tcPr>
-            <w:tcW w:type="dxa" w:w="1247"/>
+            <w:tcW w:type="dxa" w:w="1020"/>
             <w:shd w:val="clear" w:color="auto" w:fill="EEF6F0"/>
             <w:vAlign w:val="center"/>
           </w:tcPr>
@@ -1617,7 +1666,7 @@
         </w:tc>
         <w:tc>
           <w:tcPr>
-            <w:tcW w:type="dxa" w:w="2154"/>
+            <w:tcW w:type="dxa" w:w="1814"/>
             <w:shd w:val="clear" w:color="auto" w:fill="EEF6F0"/>
             <w:vAlign w:val="center"/>
           </w:tcPr>
@@ -1641,7 +1690,7 @@
         </w:tc>
         <w:tc>
           <w:tcPr>
-            <w:tcW w:type="dxa" w:w="1134"/>
+            <w:tcW w:type="dxa" w:w="1191"/>
             <w:shd w:val="clear" w:color="auto" w:fill="EEF6F0"/>
             <w:vAlign w:val="center"/>
           </w:tcPr>
@@ -1659,7 +1708,29 @@
                 <w:szCs w:val="22"/>
                 <w:rtl/>
               </w:rPr>
-              <w:t>فعال</w:t>
+            </w:r>
+          </w:p>
+        </w:tc>
+        <w:tc>
+          <w:tcPr>
+            <w:tcW w:type="dxa" w:w="1191"/>
+            <w:shd w:val="clear" w:color="auto" w:fill="EEF6F0"/>
+            <w:vAlign w:val="center"/>
+          </w:tcPr>
+          <w:p>
+            <w:pPr>
+              <w:bidi/>
+              <w:spacing w:after="0" w:before="0" w:line="252" w:lineRule="auto"/>
+              <w:jc w:val="center"/>
+            </w:pPr>
+            <w:r>
+              <w:rPr>
+                <w:rFonts w:ascii="B Nazanin" w:hAnsi="B Nazanin" w:cs="B Nazanin" w:eastAsia="B Nazanin"/>
+                <w:b w:val="0"/>
+                <w:sz w:val="22"/>
+                <w:szCs w:val="22"/>
+                <w:rtl/>
+              </w:rPr>
             </w:r>
           </w:p>
         </w:tc>
@@ -1671,7 +1742,7 @@
         </w:trPr>
         <w:tc>
           <w:tcPr>
-            <w:tcW w:type="dxa" w:w="680"/>
+            <w:tcW w:type="dxa" w:w="567"/>
             <w:shd w:val="clear" w:color="auto" w:fill="FFFFFF"/>
             <w:vAlign w:val="center"/>
           </w:tcPr>
@@ -1695,7 +1766,7 @@
         </w:tc>
         <w:tc>
           <w:tcPr>
-            <w:tcW w:type="dxa" w:w="1587"/>
+            <w:tcW w:type="dxa" w:w="1474"/>
             <w:shd w:val="clear" w:color="auto" w:fill="FFFFFF"/>
             <w:vAlign w:val="center"/>
           </w:tcPr>
@@ -1719,7 +1790,7 @@
         </w:tc>
         <w:tc>
           <w:tcPr>
-            <w:tcW w:type="dxa" w:w="3061"/>
+            <w:tcW w:type="dxa" w:w="2608"/>
             <w:shd w:val="clear" w:color="auto" w:fill="FFFFFF"/>
             <w:vAlign w:val="center"/>
           </w:tcPr>
@@ -1742,7 +1813,7 @@
         </w:tc>
         <w:tc>
           <w:tcPr>
-            <w:tcW w:type="dxa" w:w="1247"/>
+            <w:tcW w:type="dxa" w:w="1020"/>
             <w:shd w:val="clear" w:color="auto" w:fill="FFFFFF"/>
             <w:vAlign w:val="center"/>
           </w:tcPr>
@@ -1766,7 +1837,7 @@
         </w:tc>
         <w:tc>
           <w:tcPr>
-            <w:tcW w:type="dxa" w:w="2154"/>
+            <w:tcW w:type="dxa" w:w="1814"/>
             <w:shd w:val="clear" w:color="auto" w:fill="FFFFFF"/>
             <w:vAlign w:val="center"/>
           </w:tcPr>
@@ -1790,7 +1861,7 @@
         </w:tc>
         <w:tc>
           <w:tcPr>
-            <w:tcW w:type="dxa" w:w="1134"/>
+            <w:tcW w:type="dxa" w:w="1191"/>
             <w:shd w:val="clear" w:color="auto" w:fill="FFFFFF"/>
             <w:vAlign w:val="center"/>
           </w:tcPr>
@@ -1808,7 +1879,29 @@
                 <w:szCs w:val="22"/>
                 <w:rtl/>
               </w:rPr>
-              <w:t>فعال</w:t>
+            </w:r>
+          </w:p>
+        </w:tc>
+        <w:tc>
+          <w:tcPr>
+            <w:tcW w:type="dxa" w:w="1191"/>
+            <w:shd w:val="clear" w:color="auto" w:fill="FFFFFF"/>
+            <w:vAlign w:val="center"/>
+          </w:tcPr>
+          <w:p>
+            <w:pPr>
+              <w:bidi/>
+              <w:spacing w:after="0" w:before="0" w:line="252" w:lineRule="auto"/>
+              <w:jc w:val="center"/>
+            </w:pPr>
+            <w:r>
+              <w:rPr>
+                <w:rFonts w:ascii="B Nazanin" w:hAnsi="B Nazanin" w:cs="B Nazanin" w:eastAsia="B Nazanin"/>
+                <w:b w:val="0"/>
+                <w:sz w:val="22"/>
+                <w:szCs w:val="22"/>
+                <w:rtl/>
+              </w:rPr>
             </w:r>
           </w:p>
         </w:tc>
@@ -1820,7 +1913,7 @@
         </w:trPr>
         <w:tc>
           <w:tcPr>
-            <w:tcW w:type="dxa" w:w="680"/>
+            <w:tcW w:type="dxa" w:w="567"/>
             <w:shd w:val="clear" w:color="auto" w:fill="EEF6F0"/>
             <w:vAlign w:val="center"/>
           </w:tcPr>
@@ -1844,7 +1937,7 @@
         </w:tc>
         <w:tc>
           <w:tcPr>
-            <w:tcW w:type="dxa" w:w="1587"/>
+            <w:tcW w:type="dxa" w:w="1474"/>
             <w:shd w:val="clear" w:color="auto" w:fill="EEF6F0"/>
             <w:vAlign w:val="center"/>
           </w:tcPr>
@@ -1868,7 +1961,7 @@
         </w:tc>
         <w:tc>
           <w:tcPr>
-            <w:tcW w:type="dxa" w:w="3061"/>
+            <w:tcW w:type="dxa" w:w="2608"/>
             <w:shd w:val="clear" w:color="auto" w:fill="EEF6F0"/>
             <w:vAlign w:val="center"/>
           </w:tcPr>
@@ -1891,7 +1984,7 @@
         </w:tc>
         <w:tc>
           <w:tcPr>
-            <w:tcW w:type="dxa" w:w="1247"/>
+            <w:tcW w:type="dxa" w:w="1020"/>
             <w:shd w:val="clear" w:color="auto" w:fill="EEF6F0"/>
             <w:vAlign w:val="center"/>
           </w:tcPr>
@@ -1915,7 +2008,7 @@
         </w:tc>
         <w:tc>
           <w:tcPr>
-            <w:tcW w:type="dxa" w:w="2154"/>
+            <w:tcW w:type="dxa" w:w="1814"/>
             <w:shd w:val="clear" w:color="auto" w:fill="EEF6F0"/>
             <w:vAlign w:val="center"/>
           </w:tcPr>
@@ -1939,7 +2032,7 @@
         </w:tc>
         <w:tc>
           <w:tcPr>
-            <w:tcW w:type="dxa" w:w="1134"/>
+            <w:tcW w:type="dxa" w:w="1191"/>
             <w:shd w:val="clear" w:color="auto" w:fill="EEF6F0"/>
             <w:vAlign w:val="center"/>
           </w:tcPr>
@@ -1957,7 +2050,29 @@
                 <w:szCs w:val="22"/>
                 <w:rtl/>
               </w:rPr>
-              <w:t>فعال</w:t>
+            </w:r>
+          </w:p>
+        </w:tc>
+        <w:tc>
+          <w:tcPr>
+            <w:tcW w:type="dxa" w:w="1191"/>
+            <w:shd w:val="clear" w:color="auto" w:fill="EEF6F0"/>
+            <w:vAlign w:val="center"/>
+          </w:tcPr>
+          <w:p>
+            <w:pPr>
+              <w:bidi/>
+              <w:spacing w:after="0" w:before="0" w:line="252" w:lineRule="auto"/>
+              <w:jc w:val="center"/>
+            </w:pPr>
+            <w:r>
+              <w:rPr>
+                <w:rFonts w:ascii="B Nazanin" w:hAnsi="B Nazanin" w:cs="B Nazanin" w:eastAsia="B Nazanin"/>
+                <w:b w:val="0"/>
+                <w:sz w:val="22"/>
+                <w:szCs w:val="22"/>
+                <w:rtl/>
+              </w:rPr>
             </w:r>
           </w:p>
         </w:tc>
@@ -1969,7 +2084,7 @@
         </w:trPr>
         <w:tc>
           <w:tcPr>
-            <w:tcW w:type="dxa" w:w="680"/>
+            <w:tcW w:type="dxa" w:w="567"/>
             <w:shd w:val="clear" w:color="auto" w:fill="FFFFFF"/>
             <w:vAlign w:val="center"/>
           </w:tcPr>
@@ -1993,7 +2108,7 @@
         </w:tc>
         <w:tc>
           <w:tcPr>
-            <w:tcW w:type="dxa" w:w="1587"/>
+            <w:tcW w:type="dxa" w:w="1474"/>
             <w:shd w:val="clear" w:color="auto" w:fill="FFFFFF"/>
             <w:vAlign w:val="center"/>
           </w:tcPr>
@@ -2017,7 +2132,7 @@
         </w:tc>
         <w:tc>
           <w:tcPr>
-            <w:tcW w:type="dxa" w:w="3061"/>
+            <w:tcW w:type="dxa" w:w="2608"/>
             <w:shd w:val="clear" w:color="auto" w:fill="FFFFFF"/>
             <w:vAlign w:val="center"/>
           </w:tcPr>
@@ -2040,7 +2155,7 @@
         </w:tc>
         <w:tc>
           <w:tcPr>
-            <w:tcW w:type="dxa" w:w="1247"/>
+            <w:tcW w:type="dxa" w:w="1020"/>
             <w:shd w:val="clear" w:color="auto" w:fill="FFFFFF"/>
             <w:vAlign w:val="center"/>
           </w:tcPr>
@@ -2064,7 +2179,7 @@
         </w:tc>
         <w:tc>
           <w:tcPr>
-            <w:tcW w:type="dxa" w:w="2154"/>
+            <w:tcW w:type="dxa" w:w="1814"/>
             <w:shd w:val="clear" w:color="auto" w:fill="FFFFFF"/>
             <w:vAlign w:val="center"/>
           </w:tcPr>
@@ -2088,7 +2203,7 @@
         </w:tc>
         <w:tc>
           <w:tcPr>
-            <w:tcW w:type="dxa" w:w="1134"/>
+            <w:tcW w:type="dxa" w:w="1191"/>
             <w:shd w:val="clear" w:color="auto" w:fill="FFFFFF"/>
             <w:vAlign w:val="center"/>
           </w:tcPr>
@@ -2106,7 +2221,29 @@
                 <w:szCs w:val="22"/>
                 <w:rtl/>
               </w:rPr>
-              <w:t>فعال</w:t>
+            </w:r>
+          </w:p>
+        </w:tc>
+        <w:tc>
+          <w:tcPr>
+            <w:tcW w:type="dxa" w:w="1191"/>
+            <w:shd w:val="clear" w:color="auto" w:fill="FFFFFF"/>
+            <w:vAlign w:val="center"/>
+          </w:tcPr>
+          <w:p>
+            <w:pPr>
+              <w:bidi/>
+              <w:spacing w:after="0" w:before="0" w:line="252" w:lineRule="auto"/>
+              <w:jc w:val="center"/>
+            </w:pPr>
+            <w:r>
+              <w:rPr>
+                <w:rFonts w:ascii="B Nazanin" w:hAnsi="B Nazanin" w:cs="B Nazanin" w:eastAsia="B Nazanin"/>
+                <w:b w:val="0"/>
+                <w:sz w:val="22"/>
+                <w:szCs w:val="22"/>
+                <w:rtl/>
+              </w:rPr>
             </w:r>
           </w:p>
         </w:tc>
@@ -2118,7 +2255,7 @@
         </w:trPr>
         <w:tc>
           <w:tcPr>
-            <w:tcW w:type="dxa" w:w="680"/>
+            <w:tcW w:type="dxa" w:w="567"/>
             <w:shd w:val="clear" w:color="auto" w:fill="EEF6F0"/>
             <w:vAlign w:val="center"/>
           </w:tcPr>
@@ -2142,7 +2279,7 @@
         </w:tc>
         <w:tc>
           <w:tcPr>
-            <w:tcW w:type="dxa" w:w="1587"/>
+            <w:tcW w:type="dxa" w:w="1474"/>
             <w:shd w:val="clear" w:color="auto" w:fill="EEF6F0"/>
             <w:vAlign w:val="center"/>
           </w:tcPr>
@@ -2166,7 +2303,7 @@
         </w:tc>
         <w:tc>
           <w:tcPr>
-            <w:tcW w:type="dxa" w:w="3061"/>
+            <w:tcW w:type="dxa" w:w="2608"/>
             <w:shd w:val="clear" w:color="auto" w:fill="EEF6F0"/>
             <w:vAlign w:val="center"/>
           </w:tcPr>
@@ -2189,7 +2326,7 @@
         </w:tc>
         <w:tc>
           <w:tcPr>
-            <w:tcW w:type="dxa" w:w="1247"/>
+            <w:tcW w:type="dxa" w:w="1020"/>
             <w:shd w:val="clear" w:color="auto" w:fill="EEF6F0"/>
             <w:vAlign w:val="center"/>
           </w:tcPr>
@@ -2213,7 +2350,7 @@
         </w:tc>
         <w:tc>
           <w:tcPr>
-            <w:tcW w:type="dxa" w:w="2154"/>
+            <w:tcW w:type="dxa" w:w="1814"/>
             <w:shd w:val="clear" w:color="auto" w:fill="EEF6F0"/>
             <w:vAlign w:val="center"/>
           </w:tcPr>
@@ -2237,7 +2374,7 @@
         </w:tc>
         <w:tc>
           <w:tcPr>
-            <w:tcW w:type="dxa" w:w="1134"/>
+            <w:tcW w:type="dxa" w:w="1191"/>
             <w:shd w:val="clear" w:color="auto" w:fill="EEF6F0"/>
             <w:vAlign w:val="center"/>
           </w:tcPr>
@@ -2255,7 +2392,29 @@
                 <w:szCs w:val="22"/>
                 <w:rtl/>
               </w:rPr>
-              <w:t>فعال</w:t>
+            </w:r>
+          </w:p>
+        </w:tc>
+        <w:tc>
+          <w:tcPr>
+            <w:tcW w:type="dxa" w:w="1191"/>
+            <w:shd w:val="clear" w:color="auto" w:fill="EEF6F0"/>
+            <w:vAlign w:val="center"/>
+          </w:tcPr>
+          <w:p>
+            <w:pPr>
+              <w:bidi/>
+              <w:spacing w:after="0" w:before="0" w:line="252" w:lineRule="auto"/>
+              <w:jc w:val="center"/>
+            </w:pPr>
+            <w:r>
+              <w:rPr>
+                <w:rFonts w:ascii="B Nazanin" w:hAnsi="B Nazanin" w:cs="B Nazanin" w:eastAsia="B Nazanin"/>
+                <w:b w:val="0"/>
+                <w:sz w:val="22"/>
+                <w:szCs w:val="22"/>
+                <w:rtl/>
+              </w:rPr>
             </w:r>
           </w:p>
         </w:tc>
@@ -2267,7 +2426,7 @@
         </w:trPr>
         <w:tc>
           <w:tcPr>
-            <w:tcW w:type="dxa" w:w="680"/>
+            <w:tcW w:type="dxa" w:w="567"/>
             <w:shd w:val="clear" w:color="auto" w:fill="FFFFFF"/>
             <w:vAlign w:val="center"/>
           </w:tcPr>
@@ -2291,7 +2450,7 @@
         </w:tc>
         <w:tc>
           <w:tcPr>
-            <w:tcW w:type="dxa" w:w="1587"/>
+            <w:tcW w:type="dxa" w:w="1474"/>
             <w:shd w:val="clear" w:color="auto" w:fill="FFFFFF"/>
             <w:vAlign w:val="center"/>
           </w:tcPr>
@@ -2315,7 +2474,7 @@
         </w:tc>
         <w:tc>
           <w:tcPr>
-            <w:tcW w:type="dxa" w:w="3061"/>
+            <w:tcW w:type="dxa" w:w="2608"/>
             <w:shd w:val="clear" w:color="auto" w:fill="FFFFFF"/>
             <w:vAlign w:val="center"/>
           </w:tcPr>
@@ -2338,7 +2497,7 @@
         </w:tc>
         <w:tc>
           <w:tcPr>
-            <w:tcW w:type="dxa" w:w="1247"/>
+            <w:tcW w:type="dxa" w:w="1020"/>
             <w:shd w:val="clear" w:color="auto" w:fill="FFFFFF"/>
             <w:vAlign w:val="center"/>
           </w:tcPr>
@@ -2362,7 +2521,7 @@
         </w:tc>
         <w:tc>
           <w:tcPr>
-            <w:tcW w:type="dxa" w:w="2154"/>
+            <w:tcW w:type="dxa" w:w="1814"/>
             <w:shd w:val="clear" w:color="auto" w:fill="FFFFFF"/>
             <w:vAlign w:val="center"/>
           </w:tcPr>
@@ -2386,7 +2545,7 @@
         </w:tc>
         <w:tc>
           <w:tcPr>
-            <w:tcW w:type="dxa" w:w="1134"/>
+            <w:tcW w:type="dxa" w:w="1191"/>
             <w:shd w:val="clear" w:color="auto" w:fill="FFFFFF"/>
             <w:vAlign w:val="center"/>
           </w:tcPr>
@@ -2404,7 +2563,29 @@
                 <w:szCs w:val="22"/>
                 <w:rtl/>
               </w:rPr>
-              <w:t>فعال</w:t>
+            </w:r>
+          </w:p>
+        </w:tc>
+        <w:tc>
+          <w:tcPr>
+            <w:tcW w:type="dxa" w:w="1191"/>
+            <w:shd w:val="clear" w:color="auto" w:fill="FFFFFF"/>
+            <w:vAlign w:val="center"/>
+          </w:tcPr>
+          <w:p>
+            <w:pPr>
+              <w:bidi/>
+              <w:spacing w:after="0" w:before="0" w:line="252" w:lineRule="auto"/>
+              <w:jc w:val="center"/>
+            </w:pPr>
+            <w:r>
+              <w:rPr>
+                <w:rFonts w:ascii="B Nazanin" w:hAnsi="B Nazanin" w:cs="B Nazanin" w:eastAsia="B Nazanin"/>
+                <w:b w:val="0"/>
+                <w:sz w:val="22"/>
+                <w:szCs w:val="22"/>
+                <w:rtl/>
+              </w:rPr>
             </w:r>
           </w:p>
         </w:tc>
@@ -4944,7 +5125,7 @@
           <w:szCs w:val="28"/>
           <w:rtl/>
         </w:rPr>
-        <w:t>بدین‌وسیله گواهی می‌شود شرکت رفاقت تجارت بلوچستان نوین از تاریخ ۱۴۰۵/۰۸/۱۰ تا ۱۴۰۶/۰۸/۰۹ نماینده رسمی فروش و توزیع برنج و چای وارداتی شرکت بردیا تجارت ماندگار (با مسئولیت محدود) به شماره ثبت ۵۸۸۵۴۲، شناسه ملی ۱۴۰۱۰۶۰۵۳۰۵ و کد اقتصادی ۱۴۰۱۰۶۰۵۳۰۵ است.</w:t>
+        <w:t>بدین‌وسیله گواهی می‌شود شرکت رفاقت تجارت بلوچستان نوین از تاریخ ......../......../........ تا ......../......../........ نماینده رسمی فروش و توزیع برنج و چای وارداتی شرکت بردیا تجارت ماندگار (با مسئولیت محدود) به شماره ثبت ۵۸۸۵۴۲، شناسه ملی ۱۴۰۱۰۶۰۵۳۰۵ و کد اقتصادی ۱۴۰۱۰۶۰۵۳۰۵ است.</w:t>
       </w:r>
     </w:p>
     <w:p>
@@ -5013,7 +5194,7 @@
           <w:szCs w:val="22"/>
           <w:rtl/>
         </w:rPr>
-        <w:t>تاریخ صدور: ۱۴۰۵/۰۸/۱۰</w:t>
+        <w:t>تاریخ صدور: ......../......../........</w:t>
       </w:r>
     </w:p>
     <w:p>
@@ -5080,7 +5261,7 @@
           <w:szCs w:val="28"/>
           <w:rtl/>
         </w:rPr>
-        <w:t>بدین‌وسیله گواهی می‌شود شرکت آریا تجارت چهل‌چشمه از تاریخ ۱۴۰۵/۰۸/۱۰ تا ۱۴۰۶/۰۸/۰۹ نماینده رسمی فروش و توزیع برنج و چای وارداتی شرکت بردیا تجارت ماندگار (با مسئولیت محدود) به شماره ثبت ۵۸۸۵۴۲، شناسه ملی ۱۴۰۱۰۶۰۵۳۰۵ و کد اقتصادی ۱۴۰۱۰۶۰۵۳۰۵ است.</w:t>
+        <w:t>بدین‌وسیله گواهی می‌شود شرکت آریا تجارت چهل‌چشمه از تاریخ ......../......../........ تا ......../......../........ نماینده رسمی فروش و توزیع برنج و چای وارداتی شرکت بردیا تجارت ماندگار (با مسئولیت محدود) به شماره ثبت ۵۸۸۵۴۲، شناسه ملی ۱۴۰۱۰۶۰۵۳۰۵ و کد اقتصادی ۱۴۰۱۰۶۰۵۳۰۵ است.</w:t>
       </w:r>
     </w:p>
     <w:p>
@@ -5149,7 +5330,7 @@
           <w:szCs w:val="22"/>
           <w:rtl/>
         </w:rPr>
-        <w:t>تاریخ صدور: ۱۴۰۵/۰۸/۱۰</w:t>
+        <w:t>تاریخ صدور: ......../......../........</w:t>
       </w:r>
     </w:p>
     <w:p>
@@ -5216,7 +5397,7 @@
           <w:szCs w:val="28"/>
           <w:rtl/>
         </w:rPr>
-        <w:t>بدین‌وسیله گواهی می‌شود شرکت گل‌آذین تجارت گوهردشت از تاریخ ۱۴۰۵/۰۸/۱۰ تا ۱۴۰۶/۰۸/۰۹ نماینده رسمی فروش و توزیع برنج و چای وارداتی شرکت بردیا تجارت ماندگار (با مسئولیت محدود) به شماره ثبت ۵۸۸۵۴۲، شناسه ملی ۱۴۰۱۰۶۰۵۳۰۵ و کد اقتصادی ۱۴۰۱۰۶۰۵۳۰۵ است.</w:t>
+        <w:t>بدین‌وسیله گواهی می‌شود شرکت گل‌آذین تجارت گوهردشت از تاریخ ......../......../........ تا ......../......../........ نماینده رسمی فروش و توزیع برنج و چای وارداتی شرکت بردیا تجارت ماندگار (با مسئولیت محدود) به شماره ثبت ۵۸۸۵۴۲، شناسه ملی ۱۴۰۱۰۶۰۵۳۰۵ و کد اقتصادی ۱۴۰۱۰۶۰۵۳۰۵ است.</w:t>
       </w:r>
     </w:p>
     <w:p>
@@ -5285,7 +5466,7 @@
           <w:szCs w:val="22"/>
           <w:rtl/>
         </w:rPr>
-        <w:t>تاریخ صدور: ۱۴۰۵/۰۸/۱۰</w:t>
+        <w:t>تاریخ صدور: ......../......../........</w:t>
       </w:r>
     </w:p>
     <w:p>
@@ -5352,7 +5533,7 @@
           <w:szCs w:val="28"/>
           <w:rtl/>
         </w:rPr>
-        <w:t>بدین‌وسیله گواهی می‌شود شرکت چکش طلایه گوارا نوش نظر از تاریخ ۱۴۰۵/۰۸/۱۰ تا ۱۴۰۶/۰۸/۰۹ نماینده رسمی فروش و توزیع برنج و چای وارداتی شرکت بردیا تجارت ماندگار (با مسئولیت محدود) به شماره ثبت ۵۸۸۵۴۲، شناسه ملی ۱۴۰۱۰۶۰۵۳۰۵ و کد اقتصادی ۱۴۰۱۰۶۰۵۳۰۵ است.</w:t>
+        <w:t>بدین‌وسیله گواهی می‌شود شرکت چکش طلایه گوارا نوش نظر از تاریخ ......../......../........ تا ......../......../........ نماینده رسمی فروش و توزیع برنج و چای وارداتی شرکت بردیا تجارت ماندگار (با مسئولیت محدود) به شماره ثبت ۵۸۸۵۴۲، شناسه ملی ۱۴۰۱۰۶۰۵۳۰۵ و کد اقتصادی ۱۴۰۱۰۶۰۵۳۰۵ است.</w:t>
       </w:r>
     </w:p>
     <w:p>
@@ -5421,7 +5602,7 @@
           <w:szCs w:val="22"/>
           <w:rtl/>
         </w:rPr>
-        <w:t>تاریخ صدور: ۱۴۰۵/۰۸/۱۰</w:t>
+        <w:t>تاریخ صدور: ......../......../........</w:t>
       </w:r>
     </w:p>
     <w:p>
@@ -5488,7 +5669,7 @@
           <w:szCs w:val="28"/>
           <w:rtl/>
         </w:rPr>
-        <w:t>بدین‌وسیله گواهی می‌شود شرکت القمیس از تاریخ ۱۴۰۵/۰۸/۱۰ تا ۱۴۰۶/۰۸/۰۹ نماینده رسمی فروش و توزیع برنج و چای وارداتی شرکت بردیا تجارت ماندگار (با مسئولیت محدود) به شماره ثبت ۵۸۸۵۴۲، شناسه ملی ۱۴۰۱۰۶۰۵۳۰۵ و کد اقتصادی ۱۴۰۱۰۶۰۵۳۰۵ است.</w:t>
+        <w:t>بدین‌وسیله گواهی می‌شود شرکت القمیس از تاریخ ......../......../........ تا ......../......../........ نماینده رسمی فروش و توزیع برنج و چای وارداتی شرکت بردیا تجارت ماندگار (با مسئولیت محدود) به شماره ثبت ۵۸۸۵۴۲، شناسه ملی ۱۴۰۱۰۶۰۵۳۰۵ و کد اقتصادی ۱۴۰۱۰۶۰۵۳۰۵ است.</w:t>
       </w:r>
     </w:p>
     <w:p>
@@ -5557,7 +5738,7 @@
           <w:szCs w:val="22"/>
           <w:rtl/>
         </w:rPr>
-        <w:t>تاریخ صدور: ۱۴۰۵/۰۸/۱۰</w:t>
+        <w:t>تاریخ صدور: ......../......../........</w:t>
       </w:r>
     </w:p>
     <w:p>
@@ -5624,7 +5805,7 @@
           <w:szCs w:val="28"/>
           <w:rtl/>
         </w:rPr>
-        <w:t>بدین‌وسیله گواهی می‌شود شرکت یزدان تجارت تفتان از تاریخ ۱۴۰۵/۰۸/۱۰ تا ۱۴۰۶/۰۸/۰۹ نماینده رسمی فروش و توزیع برنج و چای وارداتی شرکت بردیا تجارت ماندگار (با مسئولیت محدود) به شماره ثبت ۵۸۸۵۴۲، شناسه ملی ۱۴۰۱۰۶۰۵۳۰۵ و کد اقتصادی ۱۴۰۱۰۶۰۵۳۰۵ است.</w:t>
+        <w:t>بدین‌وسیله گواهی می‌شود شرکت یزدان تجارت تفتان از تاریخ ......../......../........ تا ......../......../........ نماینده رسمی فروش و توزیع برنج و چای وارداتی شرکت بردیا تجارت ماندگار (با مسئولیت محدود) به شماره ثبت ۵۸۸۵۴۲، شناسه ملی ۱۴۰۱۰۶۰۵۳۰۵ و کد اقتصادی ۱۴۰۱۰۶۰۵۳۰۵ است.</w:t>
       </w:r>
     </w:p>
     <w:p>
@@ -5693,7 +5874,7 @@
           <w:szCs w:val="22"/>
           <w:rtl/>
         </w:rPr>
-        <w:t>تاریخ صدور: ۱۴۰۵/۰۸/۱۰</w:t>
+        <w:t>تاریخ صدور: ......../......../........</w:t>
       </w:r>
     </w:p>
     <w:p>
@@ -5760,7 +5941,7 @@
           <w:szCs w:val="28"/>
           <w:rtl/>
         </w:rPr>
-        <w:t>بدین‌وسیله گواهی می‌شود شرکت روشنا تجارت زاهدان از تاریخ ۱۴۰۵/۰۸/۱۰ تا ۱۴۰۶/۰۸/۰۹ نماینده رسمی فروش و توزیع برنج و چای وارداتی شرکت بردیا تجارت ماندگار (با مسئولیت محدود) به شماره ثبت ۵۸۸۵۴۲، شناسه ملی ۱۴۰۱۰۶۰۵۳۰۵ و کد اقتصادی ۱۴۰۱۰۶۰۵۳۰۵ است.</w:t>
+        <w:t>بدین‌وسیله گواهی می‌شود شرکت روشنا تجارت زاهدان از تاریخ ......../......../........ تا ......../......../........ نماینده رسمی فروش و توزیع برنج و چای وارداتی شرکت بردیا تجارت ماندگار (با مسئولیت محدود) به شماره ثبت ۵۸۸۵۴۲، شناسه ملی ۱۴۰۱۰۶۰۵۳۰۵ و کد اقتصادی ۱۴۰۱۰۶۰۵۳۰۵ است.</w:t>
       </w:r>
     </w:p>
     <w:p>
@@ -5829,7 +6010,7 @@
           <w:szCs w:val="22"/>
           <w:rtl/>
         </w:rPr>
-        <w:t>تاریخ صدور: ۱۴۰۵/۰۸/۱۰</w:t>
+        <w:t>تاریخ صدور: ......../......../........</w:t>
       </w:r>
     </w:p>
     <w:sectPr>
@@ -6060,7 +6241,7 @@
               <w:szCs w:val="20"/>
               <w:rtl/>
             </w:rPr>
-            <w:t>۱۴۰۵/۰۸/۱۰</w:t>
+            <w:t>......../......../........</w:t>
           </w:r>
         </w:p>
         <w:p>

</xml_diff>

<commit_message>
Make payslip match sample layout in black and white; fix XML element order in Word files
Co-Authored-By: Claude Opus 5.5 <noreply@anthropic.com>
Claude-Session: https://claude.ai/code/session_01P5njy2pndSsBFLMsP1j6Uw
</commit_message>
<xml_diff>
--- a/AG-001 مستندات نمایندگی - بردیا تجارت ماندگار.docx
+++ b/AG-001 مستندات نمایندگی - بردیا تجارت ماندگار.docx
@@ -4,19 +4,19 @@
   <w:body>
     <w:p>
       <w:pPr>
+        <w:keepNext/>
         <w:bidi/>
         <w:spacing w:after="120" w:before="80" w:line="288" w:lineRule="auto"/>
         <w:jc w:val="center"/>
-        <w:keepNext/>
       </w:pPr>
       <w:r>
         <w:rPr>
           <w:rFonts w:ascii="B Nazanin" w:hAnsi="B Nazanin" w:cs="B Nazanin" w:eastAsia="B Nazanin"/>
           <w:b/>
           <w:bCs/>
+          <w:color w:val="1F5132"/>
           <w:sz w:val="36"/>
           <w:szCs w:val="36"/>
-          <w:color w:val="1F5132"/>
           <w:rtl/>
         </w:rPr>
         <w:t>مستندات نمایندگی فروش برنج و چای</w:t>
@@ -67,9 +67,9 @@
           <w:rFonts w:ascii="B Nazanin" w:hAnsi="B Nazanin" w:cs="B Nazanin" w:eastAsia="B Nazanin"/>
           <w:b/>
           <w:bCs/>
+          <w:color w:val="B8860B"/>
           <w:sz w:val="24"/>
           <w:szCs w:val="24"/>
-          <w:color w:val="B8860B"/>
           <w:rtl/>
         </w:rPr>
         <w:t xml:space="preserve">• </w:t>
@@ -96,9 +96,9 @@
           <w:rFonts w:ascii="B Nazanin" w:hAnsi="B Nazanin" w:cs="B Nazanin" w:eastAsia="B Nazanin"/>
           <w:b/>
           <w:bCs/>
+          <w:color w:val="B8860B"/>
           <w:sz w:val="24"/>
           <w:szCs w:val="24"/>
-          <w:color w:val="B8860B"/>
           <w:rtl/>
         </w:rPr>
         <w:t xml:space="preserve">• </w:t>
@@ -125,9 +125,9 @@
           <w:rFonts w:ascii="B Nazanin" w:hAnsi="B Nazanin" w:cs="B Nazanin" w:eastAsia="B Nazanin"/>
           <w:b/>
           <w:bCs/>
+          <w:color w:val="B8860B"/>
           <w:sz w:val="24"/>
           <w:szCs w:val="24"/>
-          <w:color w:val="B8860B"/>
           <w:rtl/>
         </w:rPr>
         <w:t xml:space="preserve">• </w:t>
@@ -154,9 +154,9 @@
           <w:rFonts w:ascii="B Nazanin" w:hAnsi="B Nazanin" w:cs="B Nazanin" w:eastAsia="B Nazanin"/>
           <w:b/>
           <w:bCs/>
+          <w:color w:val="B8860B"/>
           <w:sz w:val="24"/>
           <w:szCs w:val="24"/>
-          <w:color w:val="B8860B"/>
           <w:rtl/>
         </w:rPr>
         <w:t xml:space="preserve">• </w:t>
@@ -183,9 +183,9 @@
           <w:rFonts w:ascii="B Nazanin" w:hAnsi="B Nazanin" w:cs="B Nazanin" w:eastAsia="B Nazanin"/>
           <w:b/>
           <w:bCs/>
+          <w:color w:val="B8860B"/>
           <w:sz w:val="24"/>
           <w:szCs w:val="24"/>
-          <w:color w:val="B8860B"/>
           <w:rtl/>
         </w:rPr>
         <w:t xml:space="preserve">• </w:t>
@@ -203,21 +203,21 @@
     </w:p>
     <w:p>
       <w:pPr>
-        <w:bidi/>
-        <w:spacing w:after="120" w:before="240" w:line="288" w:lineRule="auto"/>
         <w:keepNext/>
         <w:pBdr>
           <w:bottom w:val="single" w:sz="8" w:space="3" w:color="B8860B"/>
         </w:pBdr>
+        <w:bidi/>
+        <w:spacing w:after="120" w:before="240" w:line="288" w:lineRule="auto"/>
       </w:pPr>
       <w:r>
         <w:rPr>
           <w:rFonts w:ascii="B Nazanin" w:hAnsi="B Nazanin" w:cs="B Nazanin" w:eastAsia="B Nazanin"/>
           <w:b/>
           <w:bCs/>
+          <w:color w:val="2E7D4F"/>
           <w:sz w:val="28"/>
           <w:szCs w:val="28"/>
-          <w:color w:val="2E7D4F"/>
           <w:rtl/>
         </w:rPr>
         <w:t>بخش اول: ضوابط اعطای نمایندگی</w:t>
@@ -234,9 +234,9 @@
           <w:rFonts w:ascii="B Nazanin" w:hAnsi="B Nazanin" w:cs="B Nazanin" w:eastAsia="B Nazanin"/>
           <w:b/>
           <w:bCs/>
+          <w:color w:val="1F5132"/>
           <w:sz w:val="24"/>
           <w:szCs w:val="24"/>
-          <w:color w:val="1F5132"/>
           <w:rtl/>
         </w:rPr>
         <w:t xml:space="preserve">ماده ۱ — تعریف. </w:t>
@@ -263,9 +263,9 @@
           <w:rFonts w:ascii="B Nazanin" w:hAnsi="B Nazanin" w:cs="B Nazanin" w:eastAsia="B Nazanin"/>
           <w:b/>
           <w:bCs/>
+          <w:color w:val="1F5132"/>
           <w:sz w:val="24"/>
           <w:szCs w:val="24"/>
-          <w:color w:val="1F5132"/>
           <w:rtl/>
         </w:rPr>
         <w:t xml:space="preserve">ماده ۲ — شرایط احراز. </w:t>
@@ -282,9 +282,9 @@
           <w:rFonts w:ascii="B Nazanin" w:hAnsi="B Nazanin" w:cs="B Nazanin" w:eastAsia="B Nazanin"/>
           <w:b/>
           <w:bCs/>
+          <w:color w:val="B8860B"/>
           <w:sz w:val="24"/>
           <w:szCs w:val="24"/>
-          <w:color w:val="B8860B"/>
           <w:rtl/>
         </w:rPr>
         <w:t xml:space="preserve">• </w:t>
@@ -311,9 +311,9 @@
           <w:rFonts w:ascii="B Nazanin" w:hAnsi="B Nazanin" w:cs="B Nazanin" w:eastAsia="B Nazanin"/>
           <w:b/>
           <w:bCs/>
+          <w:color w:val="B8860B"/>
           <w:sz w:val="24"/>
           <w:szCs w:val="24"/>
-          <w:color w:val="B8860B"/>
           <w:rtl/>
         </w:rPr>
         <w:t xml:space="preserve">• </w:t>
@@ -340,9 +340,9 @@
           <w:rFonts w:ascii="B Nazanin" w:hAnsi="B Nazanin" w:cs="B Nazanin" w:eastAsia="B Nazanin"/>
           <w:b/>
           <w:bCs/>
+          <w:color w:val="B8860B"/>
           <w:sz w:val="24"/>
           <w:szCs w:val="24"/>
-          <w:color w:val="B8860B"/>
           <w:rtl/>
         </w:rPr>
         <w:t xml:space="preserve">• </w:t>
@@ -369,9 +369,9 @@
           <w:rFonts w:ascii="B Nazanin" w:hAnsi="B Nazanin" w:cs="B Nazanin" w:eastAsia="B Nazanin"/>
           <w:b/>
           <w:bCs/>
+          <w:color w:val="B8860B"/>
           <w:sz w:val="24"/>
           <w:szCs w:val="24"/>
-          <w:color w:val="B8860B"/>
           <w:rtl/>
         </w:rPr>
         <w:t xml:space="preserve">• </w:t>
@@ -398,9 +398,9 @@
           <w:rFonts w:ascii="B Nazanin" w:hAnsi="B Nazanin" w:cs="B Nazanin" w:eastAsia="B Nazanin"/>
           <w:b/>
           <w:bCs/>
+          <w:color w:val="B8860B"/>
           <w:sz w:val="24"/>
           <w:szCs w:val="24"/>
-          <w:color w:val="B8860B"/>
           <w:rtl/>
         </w:rPr>
         <w:t xml:space="preserve">• </w:t>
@@ -427,9 +427,9 @@
           <w:rFonts w:ascii="B Nazanin" w:hAnsi="B Nazanin" w:cs="B Nazanin" w:eastAsia="B Nazanin"/>
           <w:b/>
           <w:bCs/>
+          <w:color w:val="1F5132"/>
           <w:sz w:val="24"/>
           <w:szCs w:val="24"/>
-          <w:color w:val="1F5132"/>
           <w:rtl/>
         </w:rPr>
         <w:t xml:space="preserve">ماده ۳ — محدوده فعالیت. </w:t>
@@ -456,9 +456,9 @@
           <w:rFonts w:ascii="B Nazanin" w:hAnsi="B Nazanin" w:cs="B Nazanin" w:eastAsia="B Nazanin"/>
           <w:b/>
           <w:bCs/>
+          <w:color w:val="1F5132"/>
           <w:sz w:val="24"/>
           <w:szCs w:val="24"/>
-          <w:color w:val="1F5132"/>
           <w:rtl/>
         </w:rPr>
         <w:t xml:space="preserve">ماده ۴ — کالا و قیمت. </w:t>
@@ -485,9 +485,9 @@
           <w:rFonts w:ascii="B Nazanin" w:hAnsi="B Nazanin" w:cs="B Nazanin" w:eastAsia="B Nazanin"/>
           <w:b/>
           <w:bCs/>
+          <w:color w:val="1F5132"/>
           <w:sz w:val="24"/>
           <w:szCs w:val="24"/>
-          <w:color w:val="1F5132"/>
           <w:rtl/>
         </w:rPr>
         <w:t xml:space="preserve">ماده ۵ — سفارش و تحویل. </w:t>
@@ -514,9 +514,9 @@
           <w:rFonts w:ascii="B Nazanin" w:hAnsi="B Nazanin" w:cs="B Nazanin" w:eastAsia="B Nazanin"/>
           <w:b/>
           <w:bCs/>
+          <w:color w:val="1F5132"/>
           <w:sz w:val="24"/>
           <w:szCs w:val="24"/>
-          <w:color w:val="1F5132"/>
           <w:rtl/>
         </w:rPr>
         <w:t xml:space="preserve">ماده ۶ — پرداخت و اعتبار. </w:t>
@@ -543,9 +543,9 @@
           <w:rFonts w:ascii="B Nazanin" w:hAnsi="B Nazanin" w:cs="B Nazanin" w:eastAsia="B Nazanin"/>
           <w:b/>
           <w:bCs/>
+          <w:color w:val="1F5132"/>
           <w:sz w:val="24"/>
           <w:szCs w:val="24"/>
-          <w:color w:val="1F5132"/>
           <w:rtl/>
         </w:rPr>
         <w:t xml:space="preserve">ماده ۷ — حداقل خرید. </w:t>
@@ -572,9 +572,9 @@
           <w:rFonts w:ascii="B Nazanin" w:hAnsi="B Nazanin" w:cs="B Nazanin" w:eastAsia="B Nazanin"/>
           <w:b/>
           <w:bCs/>
+          <w:color w:val="1F5132"/>
           <w:sz w:val="24"/>
           <w:szCs w:val="24"/>
-          <w:color w:val="1F5132"/>
           <w:rtl/>
         </w:rPr>
         <w:t xml:space="preserve">ماده ۸ — تعهدات نماینده. </w:t>
@@ -591,9 +591,9 @@
           <w:rFonts w:ascii="B Nazanin" w:hAnsi="B Nazanin" w:cs="B Nazanin" w:eastAsia="B Nazanin"/>
           <w:b/>
           <w:bCs/>
+          <w:color w:val="B8860B"/>
           <w:sz w:val="24"/>
           <w:szCs w:val="24"/>
-          <w:color w:val="B8860B"/>
           <w:rtl/>
         </w:rPr>
         <w:t xml:space="preserve">• </w:t>
@@ -620,9 +620,9 @@
           <w:rFonts w:ascii="B Nazanin" w:hAnsi="B Nazanin" w:cs="B Nazanin" w:eastAsia="B Nazanin"/>
           <w:b/>
           <w:bCs/>
+          <w:color w:val="B8860B"/>
           <w:sz w:val="24"/>
           <w:szCs w:val="24"/>
-          <w:color w:val="B8860B"/>
           <w:rtl/>
         </w:rPr>
         <w:t xml:space="preserve">• </w:t>
@@ -649,9 +649,9 @@
           <w:rFonts w:ascii="B Nazanin" w:hAnsi="B Nazanin" w:cs="B Nazanin" w:eastAsia="B Nazanin"/>
           <w:b/>
           <w:bCs/>
+          <w:color w:val="B8860B"/>
           <w:sz w:val="24"/>
           <w:szCs w:val="24"/>
-          <w:color w:val="B8860B"/>
           <w:rtl/>
         </w:rPr>
         <w:t xml:space="preserve">• </w:t>
@@ -678,9 +678,9 @@
           <w:rFonts w:ascii="B Nazanin" w:hAnsi="B Nazanin" w:cs="B Nazanin" w:eastAsia="B Nazanin"/>
           <w:b/>
           <w:bCs/>
+          <w:color w:val="B8860B"/>
           <w:sz w:val="24"/>
           <w:szCs w:val="24"/>
-          <w:color w:val="B8860B"/>
           <w:rtl/>
         </w:rPr>
         <w:t xml:space="preserve">• </w:t>
@@ -707,9 +707,9 @@
           <w:rFonts w:ascii="B Nazanin" w:hAnsi="B Nazanin" w:cs="B Nazanin" w:eastAsia="B Nazanin"/>
           <w:b/>
           <w:bCs/>
+          <w:color w:val="B8860B"/>
           <w:sz w:val="24"/>
           <w:szCs w:val="24"/>
-          <w:color w:val="B8860B"/>
           <w:rtl/>
         </w:rPr>
         <w:t xml:space="preserve">• </w:t>
@@ -736,9 +736,9 @@
           <w:rFonts w:ascii="B Nazanin" w:hAnsi="B Nazanin" w:cs="B Nazanin" w:eastAsia="B Nazanin"/>
           <w:b/>
           <w:bCs/>
+          <w:color w:val="B8860B"/>
           <w:sz w:val="24"/>
           <w:szCs w:val="24"/>
-          <w:color w:val="B8860B"/>
           <w:rtl/>
         </w:rPr>
         <w:t xml:space="preserve">• </w:t>
@@ -765,9 +765,9 @@
           <w:rFonts w:ascii="B Nazanin" w:hAnsi="B Nazanin" w:cs="B Nazanin" w:eastAsia="B Nazanin"/>
           <w:b/>
           <w:bCs/>
+          <w:color w:val="1F5132"/>
           <w:sz w:val="24"/>
           <w:szCs w:val="24"/>
-          <w:color w:val="1F5132"/>
           <w:rtl/>
         </w:rPr>
         <w:t xml:space="preserve">ماده ۹ — تعهدات شرکت. </w:t>
@@ -784,9 +784,9 @@
           <w:rFonts w:ascii="B Nazanin" w:hAnsi="B Nazanin" w:cs="B Nazanin" w:eastAsia="B Nazanin"/>
           <w:b/>
           <w:bCs/>
+          <w:color w:val="B8860B"/>
           <w:sz w:val="24"/>
           <w:szCs w:val="24"/>
-          <w:color w:val="B8860B"/>
           <w:rtl/>
         </w:rPr>
         <w:t xml:space="preserve">• </w:t>
@@ -813,9 +813,9 @@
           <w:rFonts w:ascii="B Nazanin" w:hAnsi="B Nazanin" w:cs="B Nazanin" w:eastAsia="B Nazanin"/>
           <w:b/>
           <w:bCs/>
+          <w:color w:val="B8860B"/>
           <w:sz w:val="24"/>
           <w:szCs w:val="24"/>
-          <w:color w:val="B8860B"/>
           <w:rtl/>
         </w:rPr>
         <w:t xml:space="preserve">• </w:t>
@@ -842,9 +842,9 @@
           <w:rFonts w:ascii="B Nazanin" w:hAnsi="B Nazanin" w:cs="B Nazanin" w:eastAsia="B Nazanin"/>
           <w:b/>
           <w:bCs/>
+          <w:color w:val="B8860B"/>
           <w:sz w:val="24"/>
           <w:szCs w:val="24"/>
-          <w:color w:val="B8860B"/>
           <w:rtl/>
         </w:rPr>
         <w:t xml:space="preserve">• </w:t>
@@ -871,9 +871,9 @@
           <w:rFonts w:ascii="B Nazanin" w:hAnsi="B Nazanin" w:cs="B Nazanin" w:eastAsia="B Nazanin"/>
           <w:b/>
           <w:bCs/>
+          <w:color w:val="B8860B"/>
           <w:sz w:val="24"/>
           <w:szCs w:val="24"/>
-          <w:color w:val="B8860B"/>
           <w:rtl/>
         </w:rPr>
         <w:t xml:space="preserve">• </w:t>
@@ -900,9 +900,9 @@
           <w:rFonts w:ascii="B Nazanin" w:hAnsi="B Nazanin" w:cs="B Nazanin" w:eastAsia="B Nazanin"/>
           <w:b/>
           <w:bCs/>
+          <w:color w:val="1F5132"/>
           <w:sz w:val="24"/>
           <w:szCs w:val="24"/>
-          <w:color w:val="1F5132"/>
           <w:rtl/>
         </w:rPr>
         <w:t xml:space="preserve">ماده ۱۰ — ارزیابی عملکرد. </w:t>
@@ -929,9 +929,9 @@
           <w:rFonts w:ascii="B Nazanin" w:hAnsi="B Nazanin" w:cs="B Nazanin" w:eastAsia="B Nazanin"/>
           <w:b/>
           <w:bCs/>
+          <w:color w:val="1F5132"/>
           <w:sz w:val="24"/>
           <w:szCs w:val="24"/>
-          <w:color w:val="1F5132"/>
           <w:rtl/>
         </w:rPr>
         <w:t xml:space="preserve">ماده ۱۱ — مدت و تمدید. </w:t>
@@ -958,9 +958,9 @@
           <w:rFonts w:ascii="B Nazanin" w:hAnsi="B Nazanin" w:cs="B Nazanin" w:eastAsia="B Nazanin"/>
           <w:b/>
           <w:bCs/>
+          <w:color w:val="1F5132"/>
           <w:sz w:val="24"/>
           <w:szCs w:val="24"/>
-          <w:color w:val="1F5132"/>
           <w:rtl/>
         </w:rPr>
         <w:t xml:space="preserve">ماده ۱۲ — فسخ. </w:t>
@@ -977,9 +977,9 @@
           <w:rFonts w:ascii="B Nazanin" w:hAnsi="B Nazanin" w:cs="B Nazanin" w:eastAsia="B Nazanin"/>
           <w:b/>
           <w:bCs/>
+          <w:color w:val="B8860B"/>
           <w:sz w:val="24"/>
           <w:szCs w:val="24"/>
-          <w:color w:val="B8860B"/>
           <w:rtl/>
         </w:rPr>
         <w:t xml:space="preserve">• </w:t>
@@ -1006,9 +1006,9 @@
           <w:rFonts w:ascii="B Nazanin" w:hAnsi="B Nazanin" w:cs="B Nazanin" w:eastAsia="B Nazanin"/>
           <w:b/>
           <w:bCs/>
+          <w:color w:val="B8860B"/>
           <w:sz w:val="24"/>
           <w:szCs w:val="24"/>
-          <w:color w:val="B8860B"/>
           <w:rtl/>
         </w:rPr>
         <w:t xml:space="preserve">• </w:t>
@@ -1035,9 +1035,9 @@
           <w:rFonts w:ascii="B Nazanin" w:hAnsi="B Nazanin" w:cs="B Nazanin" w:eastAsia="B Nazanin"/>
           <w:b/>
           <w:bCs/>
+          <w:color w:val="B8860B"/>
           <w:sz w:val="24"/>
           <w:szCs w:val="24"/>
-          <w:color w:val="B8860B"/>
           <w:rtl/>
         </w:rPr>
         <w:t xml:space="preserve">• </w:t>
@@ -1064,9 +1064,9 @@
           <w:rFonts w:ascii="B Nazanin" w:hAnsi="B Nazanin" w:cs="B Nazanin" w:eastAsia="B Nazanin"/>
           <w:b/>
           <w:bCs/>
+          <w:color w:val="B8860B"/>
           <w:sz w:val="24"/>
           <w:szCs w:val="24"/>
-          <w:color w:val="B8860B"/>
           <w:rtl/>
         </w:rPr>
         <w:t xml:space="preserve">• </w:t>
@@ -1093,9 +1093,9 @@
           <w:rFonts w:ascii="B Nazanin" w:hAnsi="B Nazanin" w:cs="B Nazanin" w:eastAsia="B Nazanin"/>
           <w:b/>
           <w:bCs/>
+          <w:color w:val="1F5132"/>
           <w:sz w:val="24"/>
           <w:szCs w:val="24"/>
-          <w:color w:val="1F5132"/>
           <w:rtl/>
         </w:rPr>
         <w:t xml:space="preserve">ماده ۱۳ — حل اختلاف. </w:t>
@@ -1135,21 +1135,21 @@
     </w:p>
     <w:p>
       <w:pPr>
-        <w:bidi/>
-        <w:spacing w:after="120" w:before="240" w:line="288" w:lineRule="auto"/>
         <w:keepNext/>
         <w:pBdr>
           <w:bottom w:val="single" w:sz="8" w:space="3" w:color="B8860B"/>
         </w:pBdr>
+        <w:bidi/>
+        <w:spacing w:after="120" w:before="240" w:line="288" w:lineRule="auto"/>
       </w:pPr>
       <w:r>
         <w:rPr>
           <w:rFonts w:ascii="B Nazanin" w:hAnsi="B Nazanin" w:cs="B Nazanin" w:eastAsia="B Nazanin"/>
           <w:b/>
           <w:bCs/>
+          <w:color w:val="2E7D4F"/>
           <w:sz w:val="28"/>
           <w:szCs w:val="28"/>
-          <w:color w:val="2E7D4F"/>
           <w:rtl/>
         </w:rPr>
         <w:t>بخش دوم: فهرست نمایندگان فعال</w:t>
@@ -1174,10 +1174,9 @@
     </w:p>
     <w:tbl>
       <w:tblPr>
+        <w:bidiVisual/>
         <w:tblW w:type="auto" w:w="0"/>
         <w:jc w:val="center"/>
-        <w:tblLook w:firstColumn="1" w:firstRow="1" w:lastColumn="0" w:lastRow="0" w:noHBand="0" w:noVBand="1" w:val="04A0"/>
-        <w:bidiVisual/>
         <w:tblBorders>
           <w:top w:val="single" w:sz="6" w:space="0" w:color="A9CBB4"/>
           <w:left w:val="single" w:sz="6" w:space="0" w:color="A9CBB4"/>
@@ -1189,11 +1188,11 @@
         <w:tblLayout w:type="fixed"/>
         <w:tblCellMar>
           <w:top w:w="50" w:type="dxa"/>
+          <w:left w:w="100" w:type="dxa"/>
           <w:bottom w:w="50" w:type="dxa"/>
-          <w:left w:w="100" w:type="dxa"/>
           <w:right w:w="100" w:type="dxa"/>
         </w:tblCellMar>
-        <w:tblLayout w:type="fixed"/>
+        <w:tblLook w:firstColumn="1" w:firstRow="1" w:lastColumn="0" w:lastRow="0" w:noHBand="0" w:noVBand="1" w:val="04A0"/>
       </w:tblPr>
       <w:tblGrid>
         <w:gridCol w:w="567"/>
@@ -1206,8 +1205,8 @@
       </w:tblGrid>
       <w:tr>
         <w:trPr>
+          <w:cantSplit/>
           <w:trHeight w:val="510"/>
-          <w:cantSplit/>
           <w:tblHeader/>
         </w:trPr>
         <w:tc>
@@ -1227,9 +1226,9 @@
                 <w:rFonts w:ascii="B Nazanin" w:hAnsi="B Nazanin" w:cs="B Nazanin" w:eastAsia="B Nazanin"/>
                 <w:b/>
                 <w:bCs/>
+                <w:color w:val="FFFFFF"/>
                 <w:sz w:val="22"/>
                 <w:szCs w:val="22"/>
-                <w:color w:val="FFFFFF"/>
                 <w:rtl/>
               </w:rPr>
               <w:t>ردیف</w:t>
@@ -1253,9 +1252,9 @@
                 <w:rFonts w:ascii="B Nazanin" w:hAnsi="B Nazanin" w:cs="B Nazanin" w:eastAsia="B Nazanin"/>
                 <w:b/>
                 <w:bCs/>
+                <w:color w:val="FFFFFF"/>
                 <w:sz w:val="22"/>
                 <w:szCs w:val="22"/>
-                <w:color w:val="FFFFFF"/>
                 <w:rtl/>
               </w:rPr>
               <w:t>کد نمایندگی</w:t>
@@ -1279,9 +1278,9 @@
                 <w:rFonts w:ascii="B Nazanin" w:hAnsi="B Nazanin" w:cs="B Nazanin" w:eastAsia="B Nazanin"/>
                 <w:b/>
                 <w:bCs/>
+                <w:color w:val="FFFFFF"/>
                 <w:sz w:val="22"/>
                 <w:szCs w:val="22"/>
-                <w:color w:val="FFFFFF"/>
                 <w:rtl/>
               </w:rPr>
               <w:t>نام شرکت</w:t>
@@ -1305,9 +1304,9 @@
                 <w:rFonts w:ascii="B Nazanin" w:hAnsi="B Nazanin" w:cs="B Nazanin" w:eastAsia="B Nazanin"/>
                 <w:b/>
                 <w:bCs/>
+                <w:color w:val="FFFFFF"/>
                 <w:sz w:val="22"/>
                 <w:szCs w:val="22"/>
-                <w:color w:val="FFFFFF"/>
                 <w:rtl/>
               </w:rPr>
               <w:t>کالا</w:t>
@@ -1331,9 +1330,9 @@
                 <w:rFonts w:ascii="B Nazanin" w:hAnsi="B Nazanin" w:cs="B Nazanin" w:eastAsia="B Nazanin"/>
                 <w:b/>
                 <w:bCs/>
+                <w:color w:val="FFFFFF"/>
                 <w:sz w:val="22"/>
                 <w:szCs w:val="22"/>
-                <w:color w:val="FFFFFF"/>
                 <w:rtl/>
               </w:rPr>
               <w:t>شماره قرارداد</w:t>
@@ -1357,9 +1356,9 @@
                 <w:rFonts w:ascii="B Nazanin" w:hAnsi="B Nazanin" w:cs="B Nazanin" w:eastAsia="B Nazanin"/>
                 <w:b/>
                 <w:bCs/>
+                <w:color w:val="FFFFFF"/>
                 <w:sz w:val="22"/>
                 <w:szCs w:val="22"/>
-                <w:color w:val="FFFFFF"/>
                 <w:rtl/>
               </w:rPr>
               <w:t>تاریخ شروع</w:t>
@@ -1383,9 +1382,9 @@
                 <w:rFonts w:ascii="B Nazanin" w:hAnsi="B Nazanin" w:cs="B Nazanin" w:eastAsia="B Nazanin"/>
                 <w:b/>
                 <w:bCs/>
+                <w:color w:val="FFFFFF"/>
                 <w:sz w:val="22"/>
                 <w:szCs w:val="22"/>
-                <w:color w:val="FFFFFF"/>
                 <w:rtl/>
               </w:rPr>
               <w:t>تاریخ پایان</w:t>
@@ -1395,8 +1394,8 @@
       </w:tr>
       <w:tr>
         <w:trPr>
+          <w:cantSplit/>
           <w:trHeight w:val="510"/>
-          <w:cantSplit/>
         </w:trPr>
         <w:tc>
           <w:tcPr>
@@ -1566,8 +1565,8 @@
       </w:tr>
       <w:tr>
         <w:trPr>
+          <w:cantSplit/>
           <w:trHeight w:val="510"/>
-          <w:cantSplit/>
         </w:trPr>
         <w:tc>
           <w:tcPr>
@@ -1737,8 +1736,8 @@
       </w:tr>
       <w:tr>
         <w:trPr>
+          <w:cantSplit/>
           <w:trHeight w:val="510"/>
-          <w:cantSplit/>
         </w:trPr>
         <w:tc>
           <w:tcPr>
@@ -1908,8 +1907,8 @@
       </w:tr>
       <w:tr>
         <w:trPr>
+          <w:cantSplit/>
           <w:trHeight w:val="510"/>
-          <w:cantSplit/>
         </w:trPr>
         <w:tc>
           <w:tcPr>
@@ -2079,8 +2078,8 @@
       </w:tr>
       <w:tr>
         <w:trPr>
+          <w:cantSplit/>
           <w:trHeight w:val="510"/>
-          <w:cantSplit/>
         </w:trPr>
         <w:tc>
           <w:tcPr>
@@ -2250,8 +2249,8 @@
       </w:tr>
       <w:tr>
         <w:trPr>
+          <w:cantSplit/>
           <w:trHeight w:val="510"/>
-          <w:cantSplit/>
         </w:trPr>
         <w:tc>
           <w:tcPr>
@@ -2421,8 +2420,8 @@
       </w:tr>
       <w:tr>
         <w:trPr>
+          <w:cantSplit/>
           <w:trHeight w:val="510"/>
-          <w:cantSplit/>
         </w:trPr>
         <w:tc>
           <w:tcPr>
@@ -2603,21 +2602,21 @@
     </w:p>
     <w:p>
       <w:pPr>
-        <w:bidi/>
-        <w:spacing w:after="120" w:before="240" w:line="288" w:lineRule="auto"/>
         <w:keepNext/>
         <w:pBdr>
           <w:bottom w:val="single" w:sz="8" w:space="3" w:color="B8860B"/>
         </w:pBdr>
+        <w:bidi/>
+        <w:spacing w:after="120" w:before="240" w:line="288" w:lineRule="auto"/>
       </w:pPr>
       <w:r>
         <w:rPr>
           <w:rFonts w:ascii="B Nazanin" w:hAnsi="B Nazanin" w:cs="B Nazanin" w:eastAsia="B Nazanin"/>
           <w:b/>
           <w:bCs/>
+          <w:color w:val="2E7D4F"/>
           <w:sz w:val="28"/>
           <w:szCs w:val="28"/>
-          <w:color w:val="2E7D4F"/>
           <w:rtl/>
         </w:rPr>
         <w:t>بخش سوم: نمونه قرارداد نمایندگی فروش</w:t>
@@ -2651,9 +2650,9 @@
           <w:rFonts w:ascii="B Nazanin" w:hAnsi="B Nazanin" w:cs="B Nazanin" w:eastAsia="B Nazanin"/>
           <w:b/>
           <w:bCs/>
+          <w:color w:val="1F5132"/>
           <w:sz w:val="24"/>
           <w:szCs w:val="24"/>
-          <w:color w:val="1F5132"/>
           <w:rtl/>
         </w:rPr>
         <w:t xml:space="preserve">طرف اول: </w:t>
@@ -2680,9 +2679,9 @@
           <w:rFonts w:ascii="B Nazanin" w:hAnsi="B Nazanin" w:cs="B Nazanin" w:eastAsia="B Nazanin"/>
           <w:b/>
           <w:bCs/>
+          <w:color w:val="1F5132"/>
           <w:sz w:val="24"/>
           <w:szCs w:val="24"/>
-          <w:color w:val="1F5132"/>
           <w:rtl/>
         </w:rPr>
         <w:t xml:space="preserve">طرف دوم: </w:t>
@@ -2709,9 +2708,9 @@
           <w:rFonts w:ascii="B Nazanin" w:hAnsi="B Nazanin" w:cs="B Nazanin" w:eastAsia="B Nazanin"/>
           <w:b/>
           <w:bCs/>
+          <w:color w:val="1F5132"/>
           <w:sz w:val="24"/>
           <w:szCs w:val="24"/>
-          <w:color w:val="1F5132"/>
           <w:rtl/>
         </w:rPr>
         <w:t xml:space="preserve">ماده ۱ — موضوع. </w:t>
@@ -2738,9 +2737,9 @@
           <w:rFonts w:ascii="B Nazanin" w:hAnsi="B Nazanin" w:cs="B Nazanin" w:eastAsia="B Nazanin"/>
           <w:b/>
           <w:bCs/>
+          <w:color w:val="1F5132"/>
           <w:sz w:val="24"/>
           <w:szCs w:val="24"/>
-          <w:color w:val="1F5132"/>
           <w:rtl/>
         </w:rPr>
         <w:t xml:space="preserve">ماده ۲ — مدت. </w:t>
@@ -2767,9 +2766,9 @@
           <w:rFonts w:ascii="B Nazanin" w:hAnsi="B Nazanin" w:cs="B Nazanin" w:eastAsia="B Nazanin"/>
           <w:b/>
           <w:bCs/>
+          <w:color w:val="1F5132"/>
           <w:sz w:val="24"/>
           <w:szCs w:val="24"/>
-          <w:color w:val="1F5132"/>
           <w:rtl/>
         </w:rPr>
         <w:t xml:space="preserve">ماده ۳ — محدوده. </w:t>
@@ -2796,9 +2795,9 @@
           <w:rFonts w:ascii="B Nazanin" w:hAnsi="B Nazanin" w:cs="B Nazanin" w:eastAsia="B Nazanin"/>
           <w:b/>
           <w:bCs/>
+          <w:color w:val="1F5132"/>
           <w:sz w:val="24"/>
           <w:szCs w:val="24"/>
-          <w:color w:val="1F5132"/>
           <w:rtl/>
         </w:rPr>
         <w:t xml:space="preserve">ماده ۴ — قیمت و پرداخت. </w:t>
@@ -2825,9 +2824,9 @@
           <w:rFonts w:ascii="B Nazanin" w:hAnsi="B Nazanin" w:cs="B Nazanin" w:eastAsia="B Nazanin"/>
           <w:b/>
           <w:bCs/>
+          <w:color w:val="1F5132"/>
           <w:sz w:val="24"/>
           <w:szCs w:val="24"/>
-          <w:color w:val="1F5132"/>
           <w:rtl/>
         </w:rPr>
         <w:t xml:space="preserve">ماده ۵ — حداقل خرید سه‌ماهه. </w:t>
@@ -2854,9 +2853,9 @@
           <w:rFonts w:ascii="B Nazanin" w:hAnsi="B Nazanin" w:cs="B Nazanin" w:eastAsia="B Nazanin"/>
           <w:b/>
           <w:bCs/>
+          <w:color w:val="1F5132"/>
           <w:sz w:val="24"/>
           <w:szCs w:val="24"/>
-          <w:color w:val="1F5132"/>
           <w:rtl/>
         </w:rPr>
         <w:t xml:space="preserve">ماده ۶ — تضمین. </w:t>
@@ -2883,9 +2882,9 @@
           <w:rFonts w:ascii="B Nazanin" w:hAnsi="B Nazanin" w:cs="B Nazanin" w:eastAsia="B Nazanin"/>
           <w:b/>
           <w:bCs/>
+          <w:color w:val="1F5132"/>
           <w:sz w:val="24"/>
           <w:szCs w:val="24"/>
-          <w:color w:val="1F5132"/>
           <w:rtl/>
         </w:rPr>
         <w:t xml:space="preserve">ماده ۷ — تعهدات و فسخ. </w:t>
@@ -2912,9 +2911,9 @@
           <w:rFonts w:ascii="B Nazanin" w:hAnsi="B Nazanin" w:cs="B Nazanin" w:eastAsia="B Nazanin"/>
           <w:b/>
           <w:bCs/>
+          <w:color w:val="1F5132"/>
           <w:sz w:val="24"/>
           <w:szCs w:val="24"/>
-          <w:color w:val="1F5132"/>
           <w:rtl/>
         </w:rPr>
         <w:t xml:space="preserve">ماده ۸ — حل اختلاف. </w:t>
@@ -2941,9 +2940,9 @@
           <w:rFonts w:ascii="B Nazanin" w:hAnsi="B Nazanin" w:cs="B Nazanin" w:eastAsia="B Nazanin"/>
           <w:b/>
           <w:bCs/>
+          <w:color w:val="1F5132"/>
           <w:sz w:val="24"/>
           <w:szCs w:val="24"/>
-          <w:color w:val="1F5132"/>
           <w:rtl/>
         </w:rPr>
         <w:t xml:space="preserve">ماده ۹ — نسخ. </w:t>
@@ -2961,10 +2960,9 @@
     </w:p>
     <w:tbl>
       <w:tblPr>
+        <w:bidiVisual/>
         <w:tblW w:type="auto" w:w="0"/>
         <w:jc w:val="center"/>
-        <w:tblLook w:firstColumn="1" w:firstRow="1" w:lastColumn="0" w:lastRow="0" w:noHBand="0" w:noVBand="1" w:val="04A0"/>
-        <w:bidiVisual/>
         <w:tblBorders>
           <w:top w:val="single" w:sz="6" w:space="0" w:color="A9CBB4"/>
           <w:left w:val="single" w:sz="6" w:space="0" w:color="A9CBB4"/>
@@ -2976,11 +2974,11 @@
         <w:tblLayout w:type="fixed"/>
         <w:tblCellMar>
           <w:top w:w="50" w:type="dxa"/>
+          <w:left w:w="100" w:type="dxa"/>
           <w:bottom w:w="50" w:type="dxa"/>
-          <w:left w:w="100" w:type="dxa"/>
           <w:right w:w="100" w:type="dxa"/>
         </w:tblCellMar>
-        <w:tblLayout w:type="fixed"/>
+        <w:tblLook w:firstColumn="1" w:firstRow="1" w:lastColumn="0" w:lastRow="0" w:noHBand="0" w:noVBand="1" w:val="04A0"/>
       </w:tblPr>
       <w:tblGrid>
         <w:gridCol w:w="4932"/>
@@ -2988,8 +2986,8 @@
       </w:tblGrid>
       <w:tr>
         <w:trPr>
+          <w:cantSplit/>
           <w:trHeight w:val="1247"/>
-          <w:cantSplit/>
           <w:tblHeader/>
         </w:trPr>
         <w:tc>
@@ -3009,9 +3007,9 @@
                 <w:rFonts w:ascii="B Nazanin" w:hAnsi="B Nazanin" w:cs="B Nazanin" w:eastAsia="B Nazanin"/>
                 <w:b/>
                 <w:bCs/>
+                <w:color w:val="FFFFFF"/>
                 <w:sz w:val="22"/>
                 <w:szCs w:val="22"/>
-                <w:color w:val="FFFFFF"/>
                 <w:rtl/>
               </w:rPr>
               <w:t>طرف اول: شرکت بردیا تجارت ماندگار</w:t>
@@ -3028,9 +3026,9 @@
                 <w:rFonts w:ascii="B Nazanin" w:hAnsi="B Nazanin" w:cs="B Nazanin" w:eastAsia="B Nazanin"/>
                 <w:b/>
                 <w:bCs/>
+                <w:color w:val="FFFFFF"/>
                 <w:sz w:val="22"/>
                 <w:szCs w:val="22"/>
-                <w:color w:val="FFFFFF"/>
                 <w:rtl/>
               </w:rPr>
               <w:t>(امضا و مهر)</w:t>
@@ -3054,9 +3052,9 @@
                 <w:rFonts w:ascii="B Nazanin" w:hAnsi="B Nazanin" w:cs="B Nazanin" w:eastAsia="B Nazanin"/>
                 <w:b/>
                 <w:bCs/>
+                <w:color w:val="FFFFFF"/>
                 <w:sz w:val="22"/>
                 <w:szCs w:val="22"/>
-                <w:color w:val="FFFFFF"/>
                 <w:rtl/>
               </w:rPr>
               <w:t>طرف دوم: نماینده</w:t>
@@ -3073,9 +3071,9 @@
                 <w:rFonts w:ascii="B Nazanin" w:hAnsi="B Nazanin" w:cs="B Nazanin" w:eastAsia="B Nazanin"/>
                 <w:b/>
                 <w:bCs/>
+                <w:color w:val="FFFFFF"/>
                 <w:sz w:val="22"/>
                 <w:szCs w:val="22"/>
-                <w:color w:val="FFFFFF"/>
                 <w:rtl/>
               </w:rPr>
               <w:t>(امضا و مهر)</w:t>
@@ -3085,8 +3083,8 @@
       </w:tr>
       <w:tr>
         <w:trPr>
+          <w:cantSplit/>
           <w:trHeight w:val="1247"/>
-          <w:cantSplit/>
         </w:trPr>
         <w:tc>
           <w:tcPr>
@@ -3210,21 +3208,21 @@
     </w:p>
     <w:p>
       <w:pPr>
-        <w:bidi/>
-        <w:spacing w:after="120" w:before="240" w:line="288" w:lineRule="auto"/>
         <w:keepNext/>
         <w:pBdr>
           <w:bottom w:val="single" w:sz="8" w:space="3" w:color="B8860B"/>
         </w:pBdr>
+        <w:bidi/>
+        <w:spacing w:after="120" w:before="240" w:line="288" w:lineRule="auto"/>
       </w:pPr>
       <w:r>
         <w:rPr>
           <w:rFonts w:ascii="B Nazanin" w:hAnsi="B Nazanin" w:cs="B Nazanin" w:eastAsia="B Nazanin"/>
           <w:b/>
           <w:bCs/>
+          <w:color w:val="2E7D4F"/>
           <w:sz w:val="28"/>
           <w:szCs w:val="28"/>
-          <w:color w:val="2E7D4F"/>
           <w:rtl/>
         </w:rPr>
         <w:t>بخش چهارم: فرم مشخصات و مدارک نماینده</w:t>
@@ -3249,10 +3247,9 @@
     </w:p>
     <w:tbl>
       <w:tblPr>
+        <w:bidiVisual/>
         <w:tblW w:type="auto" w:w="0"/>
         <w:jc w:val="center"/>
-        <w:tblLook w:firstColumn="1" w:firstRow="1" w:lastColumn="0" w:lastRow="0" w:noHBand="0" w:noVBand="1" w:val="04A0"/>
-        <w:bidiVisual/>
         <w:tblBorders>
           <w:top w:val="single" w:sz="6" w:space="0" w:color="A9CBB4"/>
           <w:left w:val="single" w:sz="6" w:space="0" w:color="A9CBB4"/>
@@ -3264,11 +3261,11 @@
         <w:tblLayout w:type="fixed"/>
         <w:tblCellMar>
           <w:top w:w="50" w:type="dxa"/>
+          <w:left w:w="100" w:type="dxa"/>
           <w:bottom w:w="50" w:type="dxa"/>
-          <w:left w:w="100" w:type="dxa"/>
           <w:right w:w="100" w:type="dxa"/>
         </w:tblCellMar>
-        <w:tblLayout w:type="fixed"/>
+        <w:tblLook w:firstColumn="1" w:firstRow="1" w:lastColumn="0" w:lastRow="0" w:noHBand="0" w:noVBand="1" w:val="04A0"/>
       </w:tblPr>
       <w:tblGrid>
         <w:gridCol w:w="3061"/>
@@ -3276,8 +3273,8 @@
       </w:tblGrid>
       <w:tr>
         <w:trPr>
+          <w:cantSplit/>
           <w:trHeight w:val="482"/>
-          <w:cantSplit/>
           <w:tblHeader/>
         </w:trPr>
         <w:tc>
@@ -3297,9 +3294,9 @@
                 <w:rFonts w:ascii="B Nazanin" w:hAnsi="B Nazanin" w:cs="B Nazanin" w:eastAsia="B Nazanin"/>
                 <w:b/>
                 <w:bCs/>
+                <w:color w:val="FFFFFF"/>
                 <w:sz w:val="22"/>
                 <w:szCs w:val="22"/>
-                <w:color w:val="FFFFFF"/>
                 <w:rtl/>
               </w:rPr>
               <w:t>مشخصات</w:t>
@@ -3323,9 +3320,9 @@
                 <w:rFonts w:ascii="B Nazanin" w:hAnsi="B Nazanin" w:cs="B Nazanin" w:eastAsia="B Nazanin"/>
                 <w:b/>
                 <w:bCs/>
+                <w:color w:val="FFFFFF"/>
                 <w:sz w:val="22"/>
                 <w:szCs w:val="22"/>
-                <w:color w:val="FFFFFF"/>
                 <w:rtl/>
               </w:rPr>
               <w:t>شرح</w:t>
@@ -3335,8 +3332,8 @@
       </w:tr>
       <w:tr>
         <w:trPr>
+          <w:cantSplit/>
           <w:trHeight w:val="482"/>
-          <w:cantSplit/>
         </w:trPr>
         <w:tc>
           <w:tcPr>
@@ -3386,8 +3383,8 @@
       </w:tr>
       <w:tr>
         <w:trPr>
+          <w:cantSplit/>
           <w:trHeight w:val="482"/>
-          <w:cantSplit/>
         </w:trPr>
         <w:tc>
           <w:tcPr>
@@ -3437,8 +3434,8 @@
       </w:tr>
       <w:tr>
         <w:trPr>
+          <w:cantSplit/>
           <w:trHeight w:val="482"/>
-          <w:cantSplit/>
         </w:trPr>
         <w:tc>
           <w:tcPr>
@@ -3488,8 +3485,8 @@
       </w:tr>
       <w:tr>
         <w:trPr>
+          <w:cantSplit/>
           <w:trHeight w:val="482"/>
-          <w:cantSplit/>
         </w:trPr>
         <w:tc>
           <w:tcPr>
@@ -3539,8 +3536,8 @@
       </w:tr>
       <w:tr>
         <w:trPr>
+          <w:cantSplit/>
           <w:trHeight w:val="482"/>
-          <w:cantSplit/>
         </w:trPr>
         <w:tc>
           <w:tcPr>
@@ -3590,8 +3587,8 @@
       </w:tr>
       <w:tr>
         <w:trPr>
+          <w:cantSplit/>
           <w:trHeight w:val="482"/>
-          <w:cantSplit/>
         </w:trPr>
         <w:tc>
           <w:tcPr>
@@ -3641,8 +3638,8 @@
       </w:tr>
       <w:tr>
         <w:trPr>
+          <w:cantSplit/>
           <w:trHeight w:val="482"/>
-          <w:cantSplit/>
         </w:trPr>
         <w:tc>
           <w:tcPr>
@@ -3692,8 +3689,8 @@
       </w:tr>
       <w:tr>
         <w:trPr>
+          <w:cantSplit/>
           <w:trHeight w:val="482"/>
-          <w:cantSplit/>
         </w:trPr>
         <w:tc>
           <w:tcPr>
@@ -3749,10 +3746,9 @@
     </w:p>
     <w:tbl>
       <w:tblPr>
+        <w:bidiVisual/>
         <w:tblW w:type="auto" w:w="0"/>
         <w:jc w:val="center"/>
-        <w:tblLook w:firstColumn="1" w:firstRow="1" w:lastColumn="0" w:lastRow="0" w:noHBand="0" w:noVBand="1" w:val="04A0"/>
-        <w:bidiVisual/>
         <w:tblBorders>
           <w:top w:val="single" w:sz="6" w:space="0" w:color="A9CBB4"/>
           <w:left w:val="single" w:sz="6" w:space="0" w:color="A9CBB4"/>
@@ -3764,11 +3760,11 @@
         <w:tblLayout w:type="fixed"/>
         <w:tblCellMar>
           <w:top w:w="50" w:type="dxa"/>
+          <w:left w:w="100" w:type="dxa"/>
           <w:bottom w:w="50" w:type="dxa"/>
-          <w:left w:w="100" w:type="dxa"/>
           <w:right w:w="100" w:type="dxa"/>
         </w:tblCellMar>
-        <w:tblLayout w:type="fixed"/>
+        <w:tblLook w:firstColumn="1" w:firstRow="1" w:lastColumn="0" w:lastRow="0" w:noHBand="0" w:noVBand="1" w:val="04A0"/>
       </w:tblPr>
       <w:tblGrid>
         <w:gridCol w:w="680"/>
@@ -3798,9 +3794,9 @@
                 <w:rFonts w:ascii="B Nazanin" w:hAnsi="B Nazanin" w:cs="B Nazanin" w:eastAsia="B Nazanin"/>
                 <w:b/>
                 <w:bCs/>
+                <w:color w:val="FFFFFF"/>
                 <w:sz w:val="22"/>
                 <w:szCs w:val="22"/>
-                <w:color w:val="FFFFFF"/>
                 <w:rtl/>
               </w:rPr>
               <w:t>ردیف</w:t>
@@ -3824,9 +3820,9 @@
                 <w:rFonts w:ascii="B Nazanin" w:hAnsi="B Nazanin" w:cs="B Nazanin" w:eastAsia="B Nazanin"/>
                 <w:b/>
                 <w:bCs/>
+                <w:color w:val="FFFFFF"/>
                 <w:sz w:val="22"/>
                 <w:szCs w:val="22"/>
-                <w:color w:val="FFFFFF"/>
                 <w:rtl/>
               </w:rPr>
               <w:t>مدرک</w:t>
@@ -3850,9 +3846,9 @@
                 <w:rFonts w:ascii="B Nazanin" w:hAnsi="B Nazanin" w:cs="B Nazanin" w:eastAsia="B Nazanin"/>
                 <w:b/>
                 <w:bCs/>
+                <w:color w:val="FFFFFF"/>
                 <w:sz w:val="22"/>
                 <w:szCs w:val="22"/>
-                <w:color w:val="FFFFFF"/>
                 <w:rtl/>
               </w:rPr>
               <w:t>دریافت شد</w:t>
@@ -3876,9 +3872,9 @@
                 <w:rFonts w:ascii="B Nazanin" w:hAnsi="B Nazanin" w:cs="B Nazanin" w:eastAsia="B Nazanin"/>
                 <w:b/>
                 <w:bCs/>
+                <w:color w:val="FFFFFF"/>
                 <w:sz w:val="22"/>
                 <w:szCs w:val="22"/>
-                <w:color w:val="FFFFFF"/>
                 <w:rtl/>
               </w:rPr>
               <w:t>توضیحات</w:t>
@@ -4776,10 +4772,9 @@
     </w:p>
     <w:tbl>
       <w:tblPr>
+        <w:bidiVisual/>
         <w:tblW w:type="auto" w:w="0"/>
         <w:jc w:val="center"/>
-        <w:tblLook w:firstColumn="1" w:firstRow="1" w:lastColumn="0" w:lastRow="0" w:noHBand="0" w:noVBand="1" w:val="04A0"/>
-        <w:bidiVisual/>
         <w:tblBorders>
           <w:top w:val="single" w:sz="6" w:space="0" w:color="A9CBB4"/>
           <w:left w:val="single" w:sz="6" w:space="0" w:color="A9CBB4"/>
@@ -4791,11 +4786,11 @@
         <w:tblLayout w:type="fixed"/>
         <w:tblCellMar>
           <w:top w:w="50" w:type="dxa"/>
+          <w:left w:w="100" w:type="dxa"/>
           <w:bottom w:w="50" w:type="dxa"/>
-          <w:left w:w="100" w:type="dxa"/>
           <w:right w:w="100" w:type="dxa"/>
         </w:tblCellMar>
-        <w:tblLayout w:type="fixed"/>
+        <w:tblLook w:firstColumn="1" w:firstRow="1" w:lastColumn="0" w:lastRow="0" w:noHBand="0" w:noVBand="1" w:val="04A0"/>
       </w:tblPr>
       <w:tblGrid>
         <w:gridCol w:w="3288"/>
@@ -4804,8 +4799,8 @@
       </w:tblGrid>
       <w:tr>
         <w:trPr>
+          <w:cantSplit/>
           <w:trHeight w:val="1247"/>
-          <w:cantSplit/>
           <w:tblHeader/>
         </w:trPr>
         <w:tc>
@@ -4825,9 +4820,9 @@
                 <w:rFonts w:ascii="B Nazanin" w:hAnsi="B Nazanin" w:cs="B Nazanin" w:eastAsia="B Nazanin"/>
                 <w:b/>
                 <w:bCs/>
+                <w:color w:val="FFFFFF"/>
                 <w:sz w:val="22"/>
                 <w:szCs w:val="22"/>
-                <w:color w:val="FFFFFF"/>
                 <w:rtl/>
               </w:rPr>
               <w:t>تکمیل‌کننده: واحد بازرگانی</w:t>
@@ -4851,9 +4846,9 @@
                 <w:rFonts w:ascii="B Nazanin" w:hAnsi="B Nazanin" w:cs="B Nazanin" w:eastAsia="B Nazanin"/>
                 <w:b/>
                 <w:bCs/>
+                <w:color w:val="FFFFFF"/>
                 <w:sz w:val="22"/>
                 <w:szCs w:val="22"/>
-                <w:color w:val="FFFFFF"/>
                 <w:rtl/>
               </w:rPr>
               <w:t>بررسی‌کننده: واحد مالی</w:t>
@@ -4877,9 +4872,9 @@
                 <w:rFonts w:ascii="B Nazanin" w:hAnsi="B Nazanin" w:cs="B Nazanin" w:eastAsia="B Nazanin"/>
                 <w:b/>
                 <w:bCs/>
+                <w:color w:val="FFFFFF"/>
                 <w:sz w:val="22"/>
                 <w:szCs w:val="22"/>
-                <w:color w:val="FFFFFF"/>
                 <w:rtl/>
               </w:rPr>
               <w:t>تأییدکننده: مدیرعامل</w:t>
@@ -4889,8 +4884,8 @@
       </w:tr>
       <w:tr>
         <w:trPr>
+          <w:cantSplit/>
           <w:trHeight w:val="1247"/>
-          <w:cantSplit/>
         </w:trPr>
         <w:tc>
           <w:tcPr>
@@ -5075,19 +5070,19 @@
     </w:p>
     <w:p>
       <w:pPr>
+        <w:keepNext/>
         <w:bidi/>
         <w:spacing w:after="120" w:before="80" w:line="288" w:lineRule="auto"/>
         <w:jc w:val="center"/>
-        <w:keepNext/>
       </w:pPr>
       <w:r>
         <w:rPr>
           <w:rFonts w:ascii="B Nazanin" w:hAnsi="B Nazanin" w:cs="B Nazanin" w:eastAsia="B Nazanin"/>
           <w:b/>
           <w:bCs/>
+          <w:color w:val="1F5132"/>
           <w:sz w:val="36"/>
           <w:szCs w:val="36"/>
-          <w:color w:val="1F5132"/>
           <w:rtl/>
         </w:rPr>
         <w:t>گواهی نمایندگی فروش</w:t>
@@ -5103,9 +5098,9 @@
         <w:rPr>
           <w:rFonts w:ascii="B Nazanin" w:hAnsi="B Nazanin" w:cs="B Nazanin" w:eastAsia="B Nazanin"/>
           <w:b w:val="0"/>
+          <w:color w:val="2E7D4F"/>
           <w:sz w:val="22"/>
           <w:szCs w:val="22"/>
-          <w:color w:val="2E7D4F"/>
           <w:rtl/>
         </w:rPr>
         <w:t>کد نمایندگی: BTM-AG-01   |   شماره قرارداد: BTM-CT-1405-01</w:t>
@@ -5172,9 +5167,9 @@
         <w:rPr>
           <w:rFonts w:ascii="B Nazanin" w:hAnsi="B Nazanin" w:cs="B Nazanin" w:eastAsia="B Nazanin"/>
           <w:b w:val="0"/>
+          <w:color w:val="777777"/>
           <w:sz w:val="22"/>
           <w:szCs w:val="22"/>
-          <w:color w:val="777777"/>
           <w:rtl/>
         </w:rPr>
         <w:t>امضا و مهر</w:t>
@@ -5211,19 +5206,19 @@
     </w:p>
     <w:p>
       <w:pPr>
+        <w:keepNext/>
         <w:bidi/>
         <w:spacing w:after="120" w:before="80" w:line="288" w:lineRule="auto"/>
         <w:jc w:val="center"/>
-        <w:keepNext/>
       </w:pPr>
       <w:r>
         <w:rPr>
           <w:rFonts w:ascii="B Nazanin" w:hAnsi="B Nazanin" w:cs="B Nazanin" w:eastAsia="B Nazanin"/>
           <w:b/>
           <w:bCs/>
+          <w:color w:val="1F5132"/>
           <w:sz w:val="36"/>
           <w:szCs w:val="36"/>
-          <w:color w:val="1F5132"/>
           <w:rtl/>
         </w:rPr>
         <w:t>گواهی نمایندگی فروش</w:t>
@@ -5239,9 +5234,9 @@
         <w:rPr>
           <w:rFonts w:ascii="B Nazanin" w:hAnsi="B Nazanin" w:cs="B Nazanin" w:eastAsia="B Nazanin"/>
           <w:b w:val="0"/>
+          <w:color w:val="2E7D4F"/>
           <w:sz w:val="22"/>
           <w:szCs w:val="22"/>
-          <w:color w:val="2E7D4F"/>
           <w:rtl/>
         </w:rPr>
         <w:t>کد نمایندگی: BTM-AG-02   |   شماره قرارداد: BTM-CT-1405-02</w:t>
@@ -5308,9 +5303,9 @@
         <w:rPr>
           <w:rFonts w:ascii="B Nazanin" w:hAnsi="B Nazanin" w:cs="B Nazanin" w:eastAsia="B Nazanin"/>
           <w:b w:val="0"/>
+          <w:color w:val="777777"/>
           <w:sz w:val="22"/>
           <w:szCs w:val="22"/>
-          <w:color w:val="777777"/>
           <w:rtl/>
         </w:rPr>
         <w:t>امضا و مهر</w:t>
@@ -5347,19 +5342,19 @@
     </w:p>
     <w:p>
       <w:pPr>
+        <w:keepNext/>
         <w:bidi/>
         <w:spacing w:after="120" w:before="80" w:line="288" w:lineRule="auto"/>
         <w:jc w:val="center"/>
-        <w:keepNext/>
       </w:pPr>
       <w:r>
         <w:rPr>
           <w:rFonts w:ascii="B Nazanin" w:hAnsi="B Nazanin" w:cs="B Nazanin" w:eastAsia="B Nazanin"/>
           <w:b/>
           <w:bCs/>
+          <w:color w:val="1F5132"/>
           <w:sz w:val="36"/>
           <w:szCs w:val="36"/>
-          <w:color w:val="1F5132"/>
           <w:rtl/>
         </w:rPr>
         <w:t>گواهی نمایندگی فروش</w:t>
@@ -5375,9 +5370,9 @@
         <w:rPr>
           <w:rFonts w:ascii="B Nazanin" w:hAnsi="B Nazanin" w:cs="B Nazanin" w:eastAsia="B Nazanin"/>
           <w:b w:val="0"/>
+          <w:color w:val="2E7D4F"/>
           <w:sz w:val="22"/>
           <w:szCs w:val="22"/>
-          <w:color w:val="2E7D4F"/>
           <w:rtl/>
         </w:rPr>
         <w:t>کد نمایندگی: BTM-AG-03   |   شماره قرارداد: BTM-CT-1405-03</w:t>
@@ -5444,9 +5439,9 @@
         <w:rPr>
           <w:rFonts w:ascii="B Nazanin" w:hAnsi="B Nazanin" w:cs="B Nazanin" w:eastAsia="B Nazanin"/>
           <w:b w:val="0"/>
+          <w:color w:val="777777"/>
           <w:sz w:val="22"/>
           <w:szCs w:val="22"/>
-          <w:color w:val="777777"/>
           <w:rtl/>
         </w:rPr>
         <w:t>امضا و مهر</w:t>
@@ -5483,19 +5478,19 @@
     </w:p>
     <w:p>
       <w:pPr>
+        <w:keepNext/>
         <w:bidi/>
         <w:spacing w:after="120" w:before="80" w:line="288" w:lineRule="auto"/>
         <w:jc w:val="center"/>
-        <w:keepNext/>
       </w:pPr>
       <w:r>
         <w:rPr>
           <w:rFonts w:ascii="B Nazanin" w:hAnsi="B Nazanin" w:cs="B Nazanin" w:eastAsia="B Nazanin"/>
           <w:b/>
           <w:bCs/>
+          <w:color w:val="1F5132"/>
           <w:sz w:val="36"/>
           <w:szCs w:val="36"/>
-          <w:color w:val="1F5132"/>
           <w:rtl/>
         </w:rPr>
         <w:t>گواهی نمایندگی فروش</w:t>
@@ -5511,9 +5506,9 @@
         <w:rPr>
           <w:rFonts w:ascii="B Nazanin" w:hAnsi="B Nazanin" w:cs="B Nazanin" w:eastAsia="B Nazanin"/>
           <w:b w:val="0"/>
+          <w:color w:val="2E7D4F"/>
           <w:sz w:val="22"/>
           <w:szCs w:val="22"/>
-          <w:color w:val="2E7D4F"/>
           <w:rtl/>
         </w:rPr>
         <w:t>کد نمایندگی: BTM-AG-04   |   شماره قرارداد: BTM-CT-1405-04</w:t>
@@ -5580,9 +5575,9 @@
         <w:rPr>
           <w:rFonts w:ascii="B Nazanin" w:hAnsi="B Nazanin" w:cs="B Nazanin" w:eastAsia="B Nazanin"/>
           <w:b w:val="0"/>
+          <w:color w:val="777777"/>
           <w:sz w:val="22"/>
           <w:szCs w:val="22"/>
-          <w:color w:val="777777"/>
           <w:rtl/>
         </w:rPr>
         <w:t>امضا و مهر</w:t>
@@ -5619,19 +5614,19 @@
     </w:p>
     <w:p>
       <w:pPr>
+        <w:keepNext/>
         <w:bidi/>
         <w:spacing w:after="120" w:before="80" w:line="288" w:lineRule="auto"/>
         <w:jc w:val="center"/>
-        <w:keepNext/>
       </w:pPr>
       <w:r>
         <w:rPr>
           <w:rFonts w:ascii="B Nazanin" w:hAnsi="B Nazanin" w:cs="B Nazanin" w:eastAsia="B Nazanin"/>
           <w:b/>
           <w:bCs/>
+          <w:color w:val="1F5132"/>
           <w:sz w:val="36"/>
           <w:szCs w:val="36"/>
-          <w:color w:val="1F5132"/>
           <w:rtl/>
         </w:rPr>
         <w:t>گواهی نمایندگی فروش</w:t>
@@ -5647,9 +5642,9 @@
         <w:rPr>
           <w:rFonts w:ascii="B Nazanin" w:hAnsi="B Nazanin" w:cs="B Nazanin" w:eastAsia="B Nazanin"/>
           <w:b w:val="0"/>
+          <w:color w:val="2E7D4F"/>
           <w:sz w:val="22"/>
           <w:szCs w:val="22"/>
-          <w:color w:val="2E7D4F"/>
           <w:rtl/>
         </w:rPr>
         <w:t>کد نمایندگی: BTM-AG-05   |   شماره قرارداد: BTM-CT-1405-05</w:t>
@@ -5716,9 +5711,9 @@
         <w:rPr>
           <w:rFonts w:ascii="B Nazanin" w:hAnsi="B Nazanin" w:cs="B Nazanin" w:eastAsia="B Nazanin"/>
           <w:b w:val="0"/>
+          <w:color w:val="777777"/>
           <w:sz w:val="22"/>
           <w:szCs w:val="22"/>
-          <w:color w:val="777777"/>
           <w:rtl/>
         </w:rPr>
         <w:t>امضا و مهر</w:t>
@@ -5755,19 +5750,19 @@
     </w:p>
     <w:p>
       <w:pPr>
+        <w:keepNext/>
         <w:bidi/>
         <w:spacing w:after="120" w:before="80" w:line="288" w:lineRule="auto"/>
         <w:jc w:val="center"/>
-        <w:keepNext/>
       </w:pPr>
       <w:r>
         <w:rPr>
           <w:rFonts w:ascii="B Nazanin" w:hAnsi="B Nazanin" w:cs="B Nazanin" w:eastAsia="B Nazanin"/>
           <w:b/>
           <w:bCs/>
+          <w:color w:val="1F5132"/>
           <w:sz w:val="36"/>
           <w:szCs w:val="36"/>
-          <w:color w:val="1F5132"/>
           <w:rtl/>
         </w:rPr>
         <w:t>گواهی نمایندگی فروش</w:t>
@@ -5783,9 +5778,9 @@
         <w:rPr>
           <w:rFonts w:ascii="B Nazanin" w:hAnsi="B Nazanin" w:cs="B Nazanin" w:eastAsia="B Nazanin"/>
           <w:b w:val="0"/>
+          <w:color w:val="2E7D4F"/>
           <w:sz w:val="22"/>
           <w:szCs w:val="22"/>
-          <w:color w:val="2E7D4F"/>
           <w:rtl/>
         </w:rPr>
         <w:t>کد نمایندگی: BTM-AG-06   |   شماره قرارداد: BTM-CT-1405-06</w:t>
@@ -5852,9 +5847,9 @@
         <w:rPr>
           <w:rFonts w:ascii="B Nazanin" w:hAnsi="B Nazanin" w:cs="B Nazanin" w:eastAsia="B Nazanin"/>
           <w:b w:val="0"/>
+          <w:color w:val="777777"/>
           <w:sz w:val="22"/>
           <w:szCs w:val="22"/>
-          <w:color w:val="777777"/>
           <w:rtl/>
         </w:rPr>
         <w:t>امضا و مهر</w:t>
@@ -5891,19 +5886,19 @@
     </w:p>
     <w:p>
       <w:pPr>
+        <w:keepNext/>
         <w:bidi/>
         <w:spacing w:after="120" w:before="80" w:line="288" w:lineRule="auto"/>
         <w:jc w:val="center"/>
-        <w:keepNext/>
       </w:pPr>
       <w:r>
         <w:rPr>
           <w:rFonts w:ascii="B Nazanin" w:hAnsi="B Nazanin" w:cs="B Nazanin" w:eastAsia="B Nazanin"/>
           <w:b/>
           <w:bCs/>
+          <w:color w:val="1F5132"/>
           <w:sz w:val="36"/>
           <w:szCs w:val="36"/>
-          <w:color w:val="1F5132"/>
           <w:rtl/>
         </w:rPr>
         <w:t>گواهی نمایندگی فروش</w:t>
@@ -5919,9 +5914,9 @@
         <w:rPr>
           <w:rFonts w:ascii="B Nazanin" w:hAnsi="B Nazanin" w:cs="B Nazanin" w:eastAsia="B Nazanin"/>
           <w:b w:val="0"/>
+          <w:color w:val="2E7D4F"/>
           <w:sz w:val="22"/>
           <w:szCs w:val="22"/>
-          <w:color w:val="2E7D4F"/>
           <w:rtl/>
         </w:rPr>
         <w:t>کد نمایندگی: BTM-AG-07   |   شماره قرارداد: BTM-CT-1405-07</w:t>
@@ -5988,9 +5983,9 @@
         <w:rPr>
           <w:rFonts w:ascii="B Nazanin" w:hAnsi="B Nazanin" w:cs="B Nazanin" w:eastAsia="B Nazanin"/>
           <w:b w:val="0"/>
+          <w:color w:val="777777"/>
           <w:sz w:val="22"/>
           <w:szCs w:val="22"/>
-          <w:color w:val="777777"/>
           <w:rtl/>
         </w:rPr>
         <w:t>امضا و مهر</w:t>
@@ -6038,9 +6033,9 @@
       <w:rPr>
         <w:rFonts w:ascii="B Nazanin" w:hAnsi="B Nazanin" w:cs="B Nazanin" w:eastAsia="B Nazanin"/>
         <w:b w:val="0"/>
+        <w:color w:val="777777"/>
         <w:sz w:val="18"/>
         <w:szCs w:val="18"/>
-        <w:color w:val="777777"/>
         <w:rtl/>
       </w:rPr>
       <w:t xml:space="preserve">کد مدرک: AG-001   |   </w:t>
@@ -6048,9 +6043,9 @@
     <w:r>
       <w:rPr>
         <w:rFonts w:ascii="B Nazanin" w:hAnsi="B Nazanin" w:cs="B Nazanin" w:eastAsia="B Nazanin"/>
+        <w:color w:val="777777"/>
         <w:sz w:val="18"/>
         <w:szCs w:val="18"/>
-        <w:color w:val="777777"/>
         <w:rtl/>
       </w:rPr>
       <w:fldChar w:fldCharType="begin"/>
@@ -6065,10 +6060,9 @@
 <w:hdr xmlns:m="http://schemas.openxmlformats.org/officeDocument/2006/math" xmlns:mc="http://schemas.openxmlformats.org/markup-compatibility/2006" xmlns:mo="http://schemas.microsoft.com/office/mac/office/2008/main" xmlns:mv="urn:schemas-microsoft-com:mac:vml" xmlns:o="urn:schemas-microsoft-com:office:office" xmlns:r="http://schemas.openxmlformats.org/officeDocument/2006/relationships" xmlns:v="urn:schemas-microsoft-com:vml" xmlns:w10="urn:schemas-microsoft-com:office:word" xmlns:w14="http://schemas.microsoft.com/office/word/2010/wordml" xmlns:w="http://schemas.openxmlformats.org/wordprocessingml/2006/main" xmlns:wne="http://schemas.microsoft.com/office/word/2006/wordml" xmlns:wp14="http://schemas.microsoft.com/office/word/2010/wordprocessingDrawing" xmlns:wp="http://schemas.openxmlformats.org/drawingml/2006/wordprocessingDrawing" xmlns:wpc="http://schemas.microsoft.com/office/word/2010/wordprocessingCanvas" xmlns:wpg="http://schemas.microsoft.com/office/word/2010/wordprocessingGroup" xmlns:wpi="http://schemas.microsoft.com/office/word/2010/wordprocessingInk" xmlns:wps="http://schemas.microsoft.com/office/word/2010/wordprocessingShape" mc:Ignorable="w14 wp14">
   <w:tbl>
     <w:tblPr>
+      <w:bidiVisual/>
       <w:tblW w:type="auto" w:w="0"/>
       <w:jc w:val="center"/>
-      <w:tblLook w:firstColumn="1" w:firstRow="1" w:lastColumn="0" w:lastRow="0" w:noHBand="0" w:noVBand="1" w:val="04A0"/>
-      <w:bidiVisual/>
       <w:tblBorders>
         <w:top w:val="single" w:sz="6" w:space="0" w:color="2E7D4F"/>
         <w:left w:val="single" w:sz="6" w:space="0" w:color="2E7D4F"/>
@@ -6080,11 +6074,11 @@
       <w:tblLayout w:type="fixed"/>
       <w:tblCellMar>
         <w:top w:w="50" w:type="dxa"/>
+        <w:left w:w="100" w:type="dxa"/>
         <w:bottom w:w="50" w:type="dxa"/>
-        <w:left w:w="100" w:type="dxa"/>
         <w:right w:w="100" w:type="dxa"/>
       </w:tblCellMar>
-      <w:tblLayout w:type="fixed"/>
+      <w:tblLook w:firstColumn="1" w:firstRow="1" w:lastColumn="0" w:lastRow="0" w:noHBand="0" w:noVBand="1" w:val="04A0"/>
     </w:tblPr>
     <w:tblGrid>
       <w:gridCol w:w="3175"/>
@@ -6149,9 +6143,9 @@
               <w:rFonts w:ascii="B Nazanin" w:hAnsi="B Nazanin" w:cs="B Nazanin" w:eastAsia="B Nazanin"/>
               <w:b/>
               <w:bCs/>
+              <w:color w:val="1F5132"/>
               <w:sz w:val="21"/>
               <w:szCs w:val="21"/>
-              <w:color w:val="1F5132"/>
               <w:rtl/>
             </w:rPr>
             <w:t>شرکت بردیا تجارت ماندگار</w:t>
@@ -6174,9 +6168,9 @@
               <w:rFonts w:ascii="B Nazanin" w:hAnsi="B Nazanin" w:cs="B Nazanin" w:eastAsia="B Nazanin"/>
               <w:b/>
               <w:bCs/>
+              <w:color w:val="1F5132"/>
               <w:sz w:val="28"/>
               <w:szCs w:val="28"/>
-              <w:color w:val="1F5132"/>
               <w:rtl/>
             </w:rPr>
             <w:t>مستندات نمایندگی</w:t>
@@ -6198,9 +6192,9 @@
               <w:rFonts w:ascii="B Nazanin" w:hAnsi="B Nazanin" w:cs="B Nazanin" w:eastAsia="B Nazanin"/>
               <w:b/>
               <w:bCs/>
+              <w:color w:val="2E7D4F"/>
               <w:sz w:val="20"/>
               <w:szCs w:val="20"/>
-              <w:color w:val="2E7D4F"/>
               <w:rtl/>
             </w:rPr>
             <w:t xml:space="preserve">کد مدرک: </w:t>
@@ -6226,9 +6220,9 @@
               <w:rFonts w:ascii="B Nazanin" w:hAnsi="B Nazanin" w:cs="B Nazanin" w:eastAsia="B Nazanin"/>
               <w:b/>
               <w:bCs/>
+              <w:color w:val="2E7D4F"/>
               <w:sz w:val="20"/>
               <w:szCs w:val="20"/>
-              <w:color w:val="2E7D4F"/>
               <w:rtl/>
             </w:rPr>
             <w:t xml:space="preserve">تاریخ تهیه: </w:t>
@@ -6254,9 +6248,9 @@
               <w:rFonts w:ascii="B Nazanin" w:hAnsi="B Nazanin" w:cs="B Nazanin" w:eastAsia="B Nazanin"/>
               <w:b/>
               <w:bCs/>
+              <w:color w:val="2E7D4F"/>
               <w:sz w:val="20"/>
               <w:szCs w:val="20"/>
-              <w:color w:val="2E7D4F"/>
               <w:rtl/>
             </w:rPr>
             <w:t xml:space="preserve">شماره بازنگری: </w:t>

</xml_diff>